<commit_message>
Add edge AI dashboard and refine local decision flow
</commit_message>
<xml_diff>
--- a/交付要求/2026嵌入式大赛应用赛道作品报告模板(1) (1).docx
+++ b/交付要求/2026嵌入式大赛应用赛道作品报告模板(1) (1).docx
@@ -8,7 +8,6 @@
         <w:spacing w:line="360" w:lineRule="auto"/>
         <w:jc w:val="center"/>
         <w:rPr>
-          <w:rFonts w:hint="eastAsia"/>
           <w:sz w:val="36"/>
         </w:rPr>
       </w:pPr>
@@ -24,13 +23,13 @@
         <w:spacing w:line="360" w:lineRule="auto"/>
         <w:jc w:val="center"/>
         <w:rPr>
-          <w:rFonts w:ascii="Times New Roman" w:eastAsia="宋体" w:hAnsi="Times New Roman" w:cs="Times New Roman"/>
+          <w:rFonts w:ascii="Times New Roman" w:eastAsia="SimSun" w:hAnsi="Times New Roman" w:cs="Times New Roman"/>
           <w:sz w:val="28"/>
         </w:rPr>
       </w:pPr>
       <w:r>
         <w:rPr>
-          <w:rFonts w:ascii="Times New Roman" w:eastAsia="宋体" w:hAnsi="Times New Roman" w:cs="Times New Roman" w:hint="eastAsia"/>
+          <w:rFonts w:ascii="Times New Roman" w:eastAsia="SimSun" w:hAnsi="Times New Roman" w:cs="Times New Roman" w:hint="eastAsia"/>
           <w:color w:val="FF0000"/>
           <w:sz w:val="24"/>
         </w:rPr>
@@ -38,7 +37,7 @@
       </w:r>
       <w:r>
         <w:rPr>
-          <w:rFonts w:ascii="Times New Roman" w:eastAsia="宋体" w:hAnsi="Times New Roman" w:cs="Times New Roman" w:hint="eastAsia"/>
+          <w:rFonts w:ascii="Times New Roman" w:eastAsia="SimSun" w:hAnsi="Times New Roman" w:cs="Times New Roman" w:hint="eastAsia"/>
           <w:color w:val="FF0000"/>
           <w:sz w:val="24"/>
         </w:rPr>
@@ -46,7 +45,7 @@
       </w:r>
       <w:r>
         <w:rPr>
-          <w:rFonts w:ascii="Times New Roman" w:eastAsia="宋体" w:hAnsi="Times New Roman" w:cs="Times New Roman" w:hint="eastAsia"/>
+          <w:rFonts w:ascii="Times New Roman" w:eastAsia="SimSun" w:hAnsi="Times New Roman" w:cs="Times New Roman" w:hint="eastAsia"/>
           <w:color w:val="FF0000"/>
           <w:sz w:val="24"/>
         </w:rPr>
@@ -60,14 +59,14 @@
         </w:tabs>
         <w:spacing w:line="360" w:lineRule="auto"/>
         <w:rPr>
-          <w:rFonts w:ascii="Times New Roman" w:eastAsia="宋体" w:hAnsi="Times New Roman" w:cs="Times New Roman"/>
+          <w:rFonts w:ascii="Times New Roman" w:eastAsia="SimSun" w:hAnsi="Times New Roman" w:cs="Times New Roman"/>
           <w:b/>
           <w:sz w:val="28"/>
         </w:rPr>
       </w:pPr>
       <w:r>
         <w:rPr>
-          <w:rFonts w:ascii="Times New Roman" w:eastAsia="宋体" w:hAnsi="Times New Roman" w:cs="Times New Roman" w:hint="eastAsia"/>
+          <w:rFonts w:ascii="Times New Roman" w:eastAsia="SimSun" w:hAnsi="Times New Roman" w:cs="Times New Roman" w:hint="eastAsia"/>
           <w:b/>
           <w:sz w:val="28"/>
         </w:rPr>
@@ -75,7 +74,7 @@
       </w:r>
       <w:r>
         <w:rPr>
-          <w:rFonts w:ascii="Times New Roman" w:eastAsia="宋体" w:hAnsi="Times New Roman" w:cs="Times New Roman"/>
+          <w:rFonts w:ascii="Times New Roman" w:eastAsia="SimSun" w:hAnsi="Times New Roman" w:cs="Times New Roman"/>
           <w:b/>
           <w:sz w:val="28"/>
         </w:rPr>
@@ -88,27 +87,27 @@
         <w:spacing w:line="360" w:lineRule="auto"/>
         <w:ind w:left="420" w:firstLineChars="0" w:firstLine="0"/>
         <w:rPr>
-          <w:rFonts w:ascii="Times New Roman" w:eastAsia="宋体" w:hAnsi="Times New Roman" w:cs="Times New Roman"/>
-          <w:sz w:val="24"/>
-        </w:rPr>
-      </w:pPr>
-      <w:r>
-        <w:rPr>
-          <w:rFonts w:ascii="Times New Roman" w:eastAsia="宋体" w:hAnsi="Times New Roman" w:cs="Times New Roman" w:hint="eastAsia"/>
+          <w:rFonts w:ascii="Times New Roman" w:eastAsia="SimSun" w:hAnsi="Times New Roman" w:cs="Times New Roman"/>
+          <w:sz w:val="24"/>
+        </w:rPr>
+      </w:pPr>
+      <w:r>
+        <w:rPr>
+          <w:rFonts w:ascii="Times New Roman" w:eastAsia="SimSun" w:hAnsi="Times New Roman" w:cs="Times New Roman" w:hint="eastAsia"/>
           <w:sz w:val="24"/>
         </w:rPr>
         <w:t>8</w:t>
       </w:r>
       <w:r>
         <w:rPr>
-          <w:rFonts w:ascii="Times New Roman" w:eastAsia="宋体" w:hAnsi="Times New Roman" w:cs="Times New Roman"/>
+          <w:rFonts w:ascii="Times New Roman" w:eastAsia="SimSun" w:hAnsi="Times New Roman" w:cs="Times New Roman"/>
           <w:sz w:val="24"/>
         </w:rPr>
         <w:t>00</w:t>
       </w:r>
       <w:r>
         <w:rPr>
-          <w:rFonts w:ascii="Times New Roman" w:eastAsia="宋体" w:hAnsi="Times New Roman" w:cs="Times New Roman" w:hint="eastAsia"/>
+          <w:rFonts w:ascii="Times New Roman" w:eastAsia="SimSun" w:hAnsi="Times New Roman" w:cs="Times New Roman" w:hint="eastAsia"/>
           <w:sz w:val="24"/>
         </w:rPr>
         <w:t>字内</w:t>
@@ -118,7 +117,7 @@
       <w:pPr>
         <w:spacing w:line="360" w:lineRule="auto"/>
         <w:rPr>
-          <w:rFonts w:ascii="Times New Roman" w:eastAsia="宋体" w:hAnsi="Times New Roman" w:cs="Times New Roman"/>
+          <w:rFonts w:ascii="Times New Roman" w:eastAsia="SimSun" w:hAnsi="Times New Roman" w:cs="Times New Roman"/>
           <w:b/>
           <w:sz w:val="28"/>
         </w:rPr>
@@ -128,14 +127,14 @@
       <w:pPr>
         <w:spacing w:line="360" w:lineRule="auto"/>
         <w:rPr>
-          <w:rFonts w:ascii="Times New Roman" w:eastAsia="宋体" w:hAnsi="Times New Roman" w:cs="Times New Roman"/>
+          <w:rFonts w:ascii="Times New Roman" w:eastAsia="SimSun" w:hAnsi="Times New Roman" w:cs="Times New Roman"/>
           <w:b/>
           <w:sz w:val="28"/>
         </w:rPr>
       </w:pPr>
       <w:r>
         <w:rPr>
-          <w:rFonts w:ascii="Times New Roman" w:eastAsia="宋体" w:hAnsi="Times New Roman" w:cs="Times New Roman" w:hint="eastAsia"/>
+          <w:rFonts w:ascii="Times New Roman" w:eastAsia="SimSun" w:hAnsi="Times New Roman" w:cs="Times New Roman" w:hint="eastAsia"/>
           <w:b/>
           <w:sz w:val="28"/>
         </w:rPr>
@@ -143,7 +142,7 @@
       </w:r>
       <w:r>
         <w:rPr>
-          <w:rFonts w:ascii="Times New Roman" w:eastAsia="宋体" w:hAnsi="Times New Roman" w:cs="Times New Roman" w:hint="eastAsia"/>
+          <w:rFonts w:ascii="Times New Roman" w:eastAsia="SimSun" w:hAnsi="Times New Roman" w:cs="Times New Roman" w:hint="eastAsia"/>
           <w:b/>
           <w:sz w:val="28"/>
         </w:rPr>
@@ -151,7 +150,7 @@
       </w:r>
       <w:r>
         <w:rPr>
-          <w:rFonts w:ascii="Times New Roman" w:eastAsia="宋体" w:hAnsi="Times New Roman" w:cs="Times New Roman"/>
+          <w:rFonts w:ascii="Times New Roman" w:eastAsia="SimSun" w:hAnsi="Times New Roman" w:cs="Times New Roman"/>
           <w:b/>
           <w:sz w:val="28"/>
         </w:rPr>
@@ -159,7 +158,7 @@
       </w:r>
       <w:r>
         <w:rPr>
-          <w:rFonts w:ascii="Times New Roman" w:eastAsia="宋体" w:hAnsi="Times New Roman" w:cs="Times New Roman" w:hint="eastAsia"/>
+          <w:rFonts w:ascii="Times New Roman" w:eastAsia="SimSun" w:hAnsi="Times New Roman" w:cs="Times New Roman" w:hint="eastAsia"/>
           <w:b/>
           <w:sz w:val="24"/>
         </w:rPr>
@@ -167,7 +166,7 @@
       </w:r>
       <w:r>
         <w:rPr>
-          <w:rFonts w:ascii="Times New Roman" w:eastAsia="宋体" w:hAnsi="Times New Roman" w:cs="Times New Roman" w:hint="eastAsia"/>
+          <w:rFonts w:ascii="Times New Roman" w:eastAsia="SimSun" w:hAnsi="Times New Roman" w:cs="Times New Roman" w:hint="eastAsia"/>
           <w:b/>
           <w:sz w:val="24"/>
         </w:rPr>
@@ -184,20 +183,20 @@
         <w:spacing w:line="360" w:lineRule="auto"/>
         <w:ind w:firstLineChars="0"/>
         <w:rPr>
-          <w:rFonts w:ascii="Times New Roman" w:eastAsia="宋体" w:hAnsi="Times New Roman" w:cs="Times New Roman"/>
-          <w:sz w:val="24"/>
-        </w:rPr>
-      </w:pPr>
-      <w:r>
-        <w:rPr>
-          <w:rFonts w:ascii="Times New Roman" w:eastAsia="宋体" w:hAnsi="Times New Roman" w:cs="Times New Roman" w:hint="eastAsia"/>
+          <w:rFonts w:ascii="Times New Roman" w:eastAsia="SimSun" w:hAnsi="Times New Roman" w:cs="Times New Roman"/>
+          <w:sz w:val="24"/>
+        </w:rPr>
+      </w:pPr>
+      <w:r>
+        <w:rPr>
+          <w:rFonts w:ascii="Times New Roman" w:eastAsia="SimSun" w:hAnsi="Times New Roman" w:cs="Times New Roman" w:hint="eastAsia"/>
           <w:sz w:val="24"/>
         </w:rPr>
         <w:t>功能</w:t>
       </w:r>
       <w:r>
         <w:rPr>
-          <w:rFonts w:ascii="Times New Roman" w:eastAsia="宋体" w:hAnsi="Times New Roman" w:cs="Times New Roman" w:hint="eastAsia"/>
+          <w:rFonts w:ascii="Times New Roman" w:eastAsia="SimSun" w:hAnsi="Times New Roman" w:cs="Times New Roman" w:hint="eastAsia"/>
           <w:sz w:val="24"/>
         </w:rPr>
         <w:t>与特性</w:t>
@@ -209,34 +208,34 @@
         <w:spacing w:line="360" w:lineRule="auto"/>
         <w:ind w:left="420" w:firstLineChars="0" w:firstLine="0"/>
         <w:rPr>
-          <w:rFonts w:ascii="Times New Roman" w:eastAsia="宋体" w:hAnsi="Times New Roman" w:cs="Times New Roman"/>
-          <w:sz w:val="24"/>
-        </w:rPr>
-      </w:pPr>
-      <w:r>
-        <w:rPr>
-          <w:rFonts w:ascii="Times New Roman" w:eastAsia="宋体" w:hAnsi="Times New Roman" w:cs="Times New Roman" w:hint="eastAsia"/>
+          <w:rFonts w:ascii="Times New Roman" w:eastAsia="SimSun" w:hAnsi="Times New Roman" w:cs="Times New Roman"/>
+          <w:sz w:val="24"/>
+        </w:rPr>
+      </w:pPr>
+      <w:r>
+        <w:rPr>
+          <w:rFonts w:ascii="Times New Roman" w:eastAsia="SimSun" w:hAnsi="Times New Roman" w:cs="Times New Roman" w:hint="eastAsia"/>
           <w:sz w:val="24"/>
         </w:rPr>
         <w:t>4</w:t>
       </w:r>
       <w:r>
         <w:rPr>
-          <w:rFonts w:ascii="Times New Roman" w:eastAsia="宋体" w:hAnsi="Times New Roman" w:cs="Times New Roman"/>
+          <w:rFonts w:ascii="Times New Roman" w:eastAsia="SimSun" w:hAnsi="Times New Roman" w:cs="Times New Roman"/>
           <w:sz w:val="24"/>
         </w:rPr>
         <w:t>00</w:t>
       </w:r>
       <w:r>
         <w:rPr>
-          <w:rFonts w:ascii="Times New Roman" w:eastAsia="宋体" w:hAnsi="Times New Roman" w:cs="Times New Roman" w:hint="eastAsia"/>
+          <w:rFonts w:ascii="Times New Roman" w:eastAsia="SimSun" w:hAnsi="Times New Roman" w:cs="Times New Roman" w:hint="eastAsia"/>
           <w:sz w:val="24"/>
         </w:rPr>
         <w:t>字内</w:t>
       </w:r>
       <w:r>
         <w:rPr>
-          <w:rFonts w:ascii="Times New Roman" w:eastAsia="宋体" w:hAnsi="Times New Roman" w:cs="Times New Roman" w:hint="eastAsia"/>
+          <w:rFonts w:ascii="Times New Roman" w:eastAsia="SimSun" w:hAnsi="Times New Roman" w:cs="Times New Roman" w:hint="eastAsia"/>
           <w:color w:val="FF0000"/>
           <w:sz w:val="24"/>
         </w:rPr>
@@ -244,23 +243,12 @@
       </w:r>
       <w:r>
         <w:rPr>
-          <w:rFonts w:ascii="Times New Roman" w:eastAsia="宋体" w:hAnsi="Times New Roman" w:cs="Times New Roman" w:hint="eastAsia"/>
+          <w:rFonts w:ascii="Times New Roman" w:eastAsia="SimSun" w:hAnsi="Times New Roman" w:cs="Times New Roman" w:hint="eastAsia"/>
           <w:color w:val="FF0000"/>
           <w:sz w:val="24"/>
         </w:rPr>
         <w:t>；</w:t>
       </w:r>
-    </w:p>
-    <w:p>
-      <w:pPr>
-        <w:pStyle w:val="a3"/>
-        <w:spacing w:line="360" w:lineRule="auto"/>
-        <w:ind w:left="420" w:firstLineChars="0" w:firstLine="0"/>
-        <w:rPr>
-          <w:rFonts w:ascii="Times New Roman" w:eastAsia="宋体" w:hAnsi="Times New Roman" w:cs="Times New Roman"/>
-          <w:sz w:val="24"/>
-        </w:rPr>
-      </w:pPr>
     </w:p>
     <w:p>
       <w:pPr>
@@ -272,13 +260,13 @@
         <w:spacing w:line="360" w:lineRule="auto"/>
         <w:ind w:firstLineChars="0"/>
         <w:rPr>
-          <w:rFonts w:ascii="Times New Roman" w:eastAsia="宋体" w:hAnsi="Times New Roman" w:cs="Times New Roman"/>
-          <w:sz w:val="24"/>
-        </w:rPr>
-      </w:pPr>
-      <w:r>
-        <w:rPr>
-          <w:rFonts w:ascii="Times New Roman" w:eastAsia="宋体" w:hAnsi="Times New Roman" w:cs="Times New Roman" w:hint="eastAsia"/>
+          <w:rFonts w:ascii="Times New Roman" w:eastAsia="SimSun" w:hAnsi="Times New Roman" w:cs="Times New Roman"/>
+          <w:sz w:val="24"/>
+        </w:rPr>
+      </w:pPr>
+      <w:r>
+        <w:rPr>
+          <w:rFonts w:ascii="Times New Roman" w:eastAsia="SimSun" w:hAnsi="Times New Roman" w:cs="Times New Roman" w:hint="eastAsia"/>
           <w:sz w:val="24"/>
         </w:rPr>
         <w:t>应用领域</w:t>
@@ -290,34 +278,34 @@
         <w:spacing w:line="360" w:lineRule="auto"/>
         <w:ind w:left="420" w:firstLineChars="0" w:firstLine="0"/>
         <w:rPr>
-          <w:rFonts w:ascii="Times New Roman" w:eastAsia="宋体" w:hAnsi="Times New Roman" w:cs="Times New Roman"/>
-          <w:sz w:val="24"/>
-        </w:rPr>
-      </w:pPr>
-      <w:r>
-        <w:rPr>
-          <w:rFonts w:ascii="Times New Roman" w:eastAsia="宋体" w:hAnsi="Times New Roman" w:cs="Times New Roman" w:hint="eastAsia"/>
+          <w:rFonts w:ascii="Times New Roman" w:eastAsia="SimSun" w:hAnsi="Times New Roman" w:cs="Times New Roman"/>
+          <w:sz w:val="24"/>
+        </w:rPr>
+      </w:pPr>
+      <w:r>
+        <w:rPr>
+          <w:rFonts w:ascii="Times New Roman" w:eastAsia="SimSun" w:hAnsi="Times New Roman" w:cs="Times New Roman" w:hint="eastAsia"/>
           <w:sz w:val="24"/>
         </w:rPr>
         <w:t>4</w:t>
       </w:r>
       <w:r>
         <w:rPr>
-          <w:rFonts w:ascii="Times New Roman" w:eastAsia="宋体" w:hAnsi="Times New Roman" w:cs="Times New Roman"/>
+          <w:rFonts w:ascii="Times New Roman" w:eastAsia="SimSun" w:hAnsi="Times New Roman" w:cs="Times New Roman"/>
           <w:sz w:val="24"/>
         </w:rPr>
         <w:t>00</w:t>
       </w:r>
       <w:r>
         <w:rPr>
-          <w:rFonts w:ascii="Times New Roman" w:eastAsia="宋体" w:hAnsi="Times New Roman" w:cs="Times New Roman" w:hint="eastAsia"/>
+          <w:rFonts w:ascii="Times New Roman" w:eastAsia="SimSun" w:hAnsi="Times New Roman" w:cs="Times New Roman" w:hint="eastAsia"/>
           <w:sz w:val="24"/>
         </w:rPr>
         <w:t>字内</w:t>
       </w:r>
       <w:r>
         <w:rPr>
-          <w:rFonts w:ascii="Times New Roman" w:eastAsia="宋体" w:hAnsi="Times New Roman" w:cs="Times New Roman" w:hint="eastAsia"/>
+          <w:rFonts w:ascii="Times New Roman" w:eastAsia="SimSun" w:hAnsi="Times New Roman" w:cs="Times New Roman" w:hint="eastAsia"/>
           <w:color w:val="FF0000"/>
           <w:sz w:val="24"/>
         </w:rPr>
@@ -325,7 +313,7 @@
       </w:r>
       <w:r>
         <w:rPr>
-          <w:rFonts w:ascii="Times New Roman" w:eastAsia="宋体" w:hAnsi="Times New Roman" w:cs="Times New Roman" w:hint="eastAsia"/>
+          <w:rFonts w:ascii="Times New Roman" w:eastAsia="SimSun" w:hAnsi="Times New Roman" w:cs="Times New Roman" w:hint="eastAsia"/>
           <w:color w:val="FF0000"/>
           <w:sz w:val="24"/>
         </w:rPr>
@@ -338,7 +326,7 @@
         <w:spacing w:line="360" w:lineRule="auto"/>
         <w:ind w:left="420" w:firstLineChars="0" w:firstLine="0"/>
         <w:rPr>
-          <w:rFonts w:ascii="Times New Roman" w:eastAsia="宋体" w:hAnsi="Times New Roman" w:cs="Times New Roman"/>
+          <w:rFonts w:ascii="Times New Roman" w:eastAsia="SimSun" w:hAnsi="Times New Roman" w:cs="Times New Roman"/>
           <w:sz w:val="24"/>
         </w:rPr>
       </w:pPr>
@@ -353,13 +341,13 @@
         <w:spacing w:line="360" w:lineRule="auto"/>
         <w:ind w:firstLineChars="0"/>
         <w:rPr>
-          <w:rFonts w:ascii="Times New Roman" w:eastAsia="宋体" w:hAnsi="Times New Roman" w:cs="Times New Roman"/>
-          <w:sz w:val="24"/>
-        </w:rPr>
-      </w:pPr>
-      <w:r>
-        <w:rPr>
-          <w:rFonts w:ascii="Times New Roman" w:eastAsia="宋体" w:hAnsi="Times New Roman" w:cs="Times New Roman" w:hint="eastAsia"/>
+          <w:rFonts w:ascii="Times New Roman" w:eastAsia="SimSun" w:hAnsi="Times New Roman" w:cs="Times New Roman"/>
+          <w:sz w:val="24"/>
+        </w:rPr>
+      </w:pPr>
+      <w:r>
+        <w:rPr>
+          <w:rFonts w:ascii="Times New Roman" w:eastAsia="SimSun" w:hAnsi="Times New Roman" w:cs="Times New Roman" w:hint="eastAsia"/>
           <w:sz w:val="24"/>
         </w:rPr>
         <w:t>主要技术特点</w:t>
@@ -371,34 +359,34 @@
         <w:spacing w:line="360" w:lineRule="auto"/>
         <w:ind w:left="420" w:firstLineChars="0" w:firstLine="0"/>
         <w:rPr>
-          <w:rFonts w:ascii="Times New Roman" w:eastAsia="宋体" w:hAnsi="Times New Roman" w:cs="Times New Roman"/>
-          <w:sz w:val="24"/>
-        </w:rPr>
-      </w:pPr>
-      <w:r>
-        <w:rPr>
-          <w:rFonts w:ascii="Times New Roman" w:eastAsia="宋体" w:hAnsi="Times New Roman" w:cs="Times New Roman" w:hint="eastAsia"/>
+          <w:rFonts w:ascii="Times New Roman" w:eastAsia="SimSun" w:hAnsi="Times New Roman" w:cs="Times New Roman"/>
+          <w:sz w:val="24"/>
+        </w:rPr>
+      </w:pPr>
+      <w:r>
+        <w:rPr>
+          <w:rFonts w:ascii="Times New Roman" w:eastAsia="SimSun" w:hAnsi="Times New Roman" w:cs="Times New Roman" w:hint="eastAsia"/>
           <w:sz w:val="24"/>
         </w:rPr>
         <w:t>4</w:t>
       </w:r>
       <w:r>
         <w:rPr>
-          <w:rFonts w:ascii="Times New Roman" w:eastAsia="宋体" w:hAnsi="Times New Roman" w:cs="Times New Roman"/>
+          <w:rFonts w:ascii="Times New Roman" w:eastAsia="SimSun" w:hAnsi="Times New Roman" w:cs="Times New Roman"/>
           <w:sz w:val="24"/>
         </w:rPr>
         <w:t>00</w:t>
       </w:r>
       <w:r>
         <w:rPr>
-          <w:rFonts w:ascii="Times New Roman" w:eastAsia="宋体" w:hAnsi="Times New Roman" w:cs="Times New Roman" w:hint="eastAsia"/>
+          <w:rFonts w:ascii="Times New Roman" w:eastAsia="SimSun" w:hAnsi="Times New Roman" w:cs="Times New Roman" w:hint="eastAsia"/>
           <w:sz w:val="24"/>
         </w:rPr>
         <w:t>字内</w:t>
       </w:r>
       <w:r>
         <w:rPr>
-          <w:rFonts w:ascii="Times New Roman" w:eastAsia="宋体" w:hAnsi="Times New Roman" w:cs="Times New Roman" w:hint="eastAsia"/>
+          <w:rFonts w:ascii="Times New Roman" w:eastAsia="SimSun" w:hAnsi="Times New Roman" w:cs="Times New Roman" w:hint="eastAsia"/>
           <w:sz w:val="24"/>
         </w:rPr>
         <w:t>；</w:t>
@@ -410,7 +398,7 @@
         <w:spacing w:line="360" w:lineRule="auto"/>
         <w:ind w:left="420" w:firstLineChars="0" w:firstLine="0"/>
         <w:rPr>
-          <w:rFonts w:ascii="Times New Roman" w:eastAsia="宋体" w:hAnsi="Times New Roman" w:cs="Times New Roman"/>
+          <w:rFonts w:ascii="Times New Roman" w:eastAsia="SimSun" w:hAnsi="Times New Roman" w:cs="Times New Roman"/>
           <w:sz w:val="24"/>
         </w:rPr>
       </w:pPr>
@@ -425,20 +413,20 @@
         <w:spacing w:line="360" w:lineRule="auto"/>
         <w:ind w:firstLineChars="0"/>
         <w:rPr>
-          <w:rFonts w:ascii="Times New Roman" w:eastAsia="宋体" w:hAnsi="Times New Roman" w:cs="Times New Roman"/>
-          <w:sz w:val="24"/>
-        </w:rPr>
-      </w:pPr>
-      <w:r>
-        <w:rPr>
-          <w:rFonts w:ascii="Times New Roman" w:eastAsia="宋体" w:hAnsi="Times New Roman" w:cs="Times New Roman" w:hint="eastAsia"/>
+          <w:rFonts w:ascii="Times New Roman" w:eastAsia="SimSun" w:hAnsi="Times New Roman" w:cs="Times New Roman"/>
+          <w:sz w:val="24"/>
+        </w:rPr>
+      </w:pPr>
+      <w:r>
+        <w:rPr>
+          <w:rFonts w:ascii="Times New Roman" w:eastAsia="SimSun" w:hAnsi="Times New Roman" w:cs="Times New Roman" w:hint="eastAsia"/>
           <w:sz w:val="24"/>
         </w:rPr>
         <w:t>主要</w:t>
       </w:r>
       <w:r>
         <w:rPr>
-          <w:rFonts w:ascii="Times New Roman" w:eastAsia="宋体" w:hAnsi="Times New Roman" w:cs="Times New Roman" w:hint="eastAsia"/>
+          <w:rFonts w:ascii="Times New Roman" w:eastAsia="SimSun" w:hAnsi="Times New Roman" w:cs="Times New Roman" w:hint="eastAsia"/>
           <w:sz w:val="24"/>
         </w:rPr>
         <w:t>性能指标</w:t>
@@ -450,34 +438,34 @@
         <w:spacing w:line="360" w:lineRule="auto"/>
         <w:ind w:left="420" w:firstLineChars="0" w:firstLine="0"/>
         <w:rPr>
-          <w:rFonts w:ascii="Times New Roman" w:eastAsia="宋体" w:hAnsi="Times New Roman" w:cs="Times New Roman"/>
-          <w:sz w:val="24"/>
-        </w:rPr>
-      </w:pPr>
-      <w:r>
-        <w:rPr>
-          <w:rFonts w:ascii="Times New Roman" w:eastAsia="宋体" w:hAnsi="Times New Roman" w:cs="Times New Roman" w:hint="eastAsia"/>
+          <w:rFonts w:ascii="Times New Roman" w:eastAsia="SimSun" w:hAnsi="Times New Roman" w:cs="Times New Roman"/>
+          <w:sz w:val="24"/>
+        </w:rPr>
+      </w:pPr>
+      <w:r>
+        <w:rPr>
+          <w:rFonts w:ascii="Times New Roman" w:eastAsia="SimSun" w:hAnsi="Times New Roman" w:cs="Times New Roman" w:hint="eastAsia"/>
           <w:sz w:val="24"/>
         </w:rPr>
         <w:t>2</w:t>
       </w:r>
       <w:r>
         <w:rPr>
-          <w:rFonts w:ascii="Times New Roman" w:eastAsia="宋体" w:hAnsi="Times New Roman" w:cs="Times New Roman"/>
+          <w:rFonts w:ascii="Times New Roman" w:eastAsia="SimSun" w:hAnsi="Times New Roman" w:cs="Times New Roman"/>
           <w:sz w:val="24"/>
         </w:rPr>
         <w:t>00</w:t>
       </w:r>
       <w:r>
         <w:rPr>
-          <w:rFonts w:ascii="Times New Roman" w:eastAsia="宋体" w:hAnsi="Times New Roman" w:cs="Times New Roman" w:hint="eastAsia"/>
+          <w:rFonts w:ascii="Times New Roman" w:eastAsia="SimSun" w:hAnsi="Times New Roman" w:cs="Times New Roman" w:hint="eastAsia"/>
           <w:sz w:val="24"/>
         </w:rPr>
         <w:t>字内</w:t>
       </w:r>
       <w:r>
         <w:rPr>
-          <w:rFonts w:ascii="Times New Roman" w:eastAsia="宋体" w:hAnsi="Times New Roman" w:cs="Times New Roman" w:hint="eastAsia"/>
+          <w:rFonts w:ascii="Times New Roman" w:eastAsia="SimSun" w:hAnsi="Times New Roman" w:cs="Times New Roman" w:hint="eastAsia"/>
           <w:color w:val="FF0000"/>
           <w:sz w:val="24"/>
         </w:rPr>
@@ -485,7 +473,7 @@
       </w:r>
       <w:r>
         <w:rPr>
-          <w:rFonts w:ascii="Times New Roman" w:eastAsia="宋体" w:hAnsi="Times New Roman" w:cs="Times New Roman" w:hint="eastAsia"/>
+          <w:rFonts w:ascii="Times New Roman" w:eastAsia="SimSun" w:hAnsi="Times New Roman" w:cs="Times New Roman" w:hint="eastAsia"/>
           <w:color w:val="FF0000"/>
           <w:sz w:val="24"/>
         </w:rPr>
@@ -493,7 +481,7 @@
       </w:r>
       <w:r>
         <w:rPr>
-          <w:rFonts w:ascii="Times New Roman" w:eastAsia="宋体" w:hAnsi="Times New Roman" w:cs="Times New Roman" w:hint="eastAsia"/>
+          <w:rFonts w:ascii="Times New Roman" w:eastAsia="SimSun" w:hAnsi="Times New Roman" w:cs="Times New Roman" w:hint="eastAsia"/>
           <w:color w:val="FF0000"/>
           <w:sz w:val="24"/>
         </w:rPr>
@@ -506,7 +494,7 @@
         <w:spacing w:line="360" w:lineRule="auto"/>
         <w:ind w:left="420" w:firstLineChars="0" w:firstLine="0"/>
         <w:rPr>
-          <w:rFonts w:ascii="Times New Roman" w:eastAsia="宋体" w:hAnsi="Times New Roman" w:cs="Times New Roman"/>
+          <w:rFonts w:ascii="Times New Roman" w:eastAsia="SimSun" w:hAnsi="Times New Roman" w:cs="Times New Roman"/>
           <w:sz w:val="24"/>
         </w:rPr>
       </w:pPr>
@@ -521,13 +509,13 @@
         <w:spacing w:line="360" w:lineRule="auto"/>
         <w:ind w:firstLineChars="0"/>
         <w:rPr>
-          <w:rFonts w:ascii="Times New Roman" w:eastAsia="宋体" w:hAnsi="Times New Roman" w:cs="Times New Roman"/>
-          <w:sz w:val="24"/>
-        </w:rPr>
-      </w:pPr>
-      <w:r>
-        <w:rPr>
-          <w:rFonts w:ascii="Times New Roman" w:eastAsia="宋体" w:hAnsi="Times New Roman" w:cs="Times New Roman" w:hint="eastAsia"/>
+          <w:rFonts w:ascii="Times New Roman" w:eastAsia="SimSun" w:hAnsi="Times New Roman" w:cs="Times New Roman"/>
+          <w:sz w:val="24"/>
+        </w:rPr>
+      </w:pPr>
+      <w:r>
+        <w:rPr>
+          <w:rFonts w:ascii="Times New Roman" w:eastAsia="SimSun" w:hAnsi="Times New Roman" w:cs="Times New Roman" w:hint="eastAsia"/>
           <w:sz w:val="24"/>
         </w:rPr>
         <w:t>主要创新点</w:t>
@@ -539,34 +527,34 @@
         <w:spacing w:line="360" w:lineRule="auto"/>
         <w:ind w:left="420" w:firstLineChars="0" w:firstLine="0"/>
         <w:rPr>
-          <w:rFonts w:ascii="Times New Roman" w:eastAsia="宋体" w:hAnsi="Times New Roman" w:cs="Times New Roman"/>
-          <w:sz w:val="24"/>
-        </w:rPr>
-      </w:pPr>
-      <w:r>
-        <w:rPr>
-          <w:rFonts w:ascii="Times New Roman" w:eastAsia="宋体" w:hAnsi="Times New Roman" w:cs="Times New Roman" w:hint="eastAsia"/>
+          <w:rFonts w:ascii="Times New Roman" w:eastAsia="SimSun" w:hAnsi="Times New Roman" w:cs="Times New Roman"/>
+          <w:sz w:val="24"/>
+        </w:rPr>
+      </w:pPr>
+      <w:r>
+        <w:rPr>
+          <w:rFonts w:ascii="Times New Roman" w:eastAsia="SimSun" w:hAnsi="Times New Roman" w:cs="Times New Roman" w:hint="eastAsia"/>
           <w:sz w:val="24"/>
         </w:rPr>
         <w:t>2</w:t>
       </w:r>
       <w:r>
         <w:rPr>
-          <w:rFonts w:ascii="Times New Roman" w:eastAsia="宋体" w:hAnsi="Times New Roman" w:cs="Times New Roman" w:hint="eastAsia"/>
+          <w:rFonts w:ascii="Times New Roman" w:eastAsia="SimSun" w:hAnsi="Times New Roman" w:cs="Times New Roman" w:hint="eastAsia"/>
           <w:sz w:val="24"/>
         </w:rPr>
         <w:t>00</w:t>
       </w:r>
       <w:r>
         <w:rPr>
-          <w:rFonts w:ascii="Times New Roman" w:eastAsia="宋体" w:hAnsi="Times New Roman" w:cs="Times New Roman" w:hint="eastAsia"/>
+          <w:rFonts w:ascii="Times New Roman" w:eastAsia="SimSun" w:hAnsi="Times New Roman" w:cs="Times New Roman" w:hint="eastAsia"/>
           <w:sz w:val="24"/>
         </w:rPr>
         <w:t>字以内</w:t>
       </w:r>
       <w:r>
         <w:rPr>
-          <w:rFonts w:ascii="Times New Roman" w:eastAsia="宋体" w:hAnsi="Times New Roman" w:cs="Times New Roman" w:hint="eastAsia"/>
+          <w:rFonts w:ascii="Times New Roman" w:eastAsia="SimSun" w:hAnsi="Times New Roman" w:cs="Times New Roman" w:hint="eastAsia"/>
           <w:color w:val="FF0000"/>
           <w:sz w:val="24"/>
         </w:rPr>
@@ -574,7 +562,7 @@
       </w:r>
       <w:r>
         <w:rPr>
-          <w:rFonts w:ascii="Times New Roman" w:eastAsia="宋体" w:hAnsi="Times New Roman" w:cs="Times New Roman" w:hint="eastAsia"/>
+          <w:rFonts w:ascii="Times New Roman" w:eastAsia="SimSun" w:hAnsi="Times New Roman" w:cs="Times New Roman" w:hint="eastAsia"/>
           <w:color w:val="FF0000"/>
           <w:sz w:val="24"/>
         </w:rPr>
@@ -582,7 +570,7 @@
       </w:r>
       <w:r>
         <w:rPr>
-          <w:rFonts w:ascii="Times New Roman" w:eastAsia="宋体" w:hAnsi="Times New Roman" w:cs="Times New Roman" w:hint="eastAsia"/>
+          <w:rFonts w:ascii="Times New Roman" w:eastAsia="SimSun" w:hAnsi="Times New Roman" w:cs="Times New Roman" w:hint="eastAsia"/>
           <w:color w:val="FF0000"/>
           <w:sz w:val="24"/>
         </w:rPr>
@@ -590,7 +578,7 @@
       </w:r>
       <w:r>
         <w:rPr>
-          <w:rFonts w:ascii="Times New Roman" w:eastAsia="宋体" w:hAnsi="Times New Roman" w:cs="Times New Roman" w:hint="eastAsia"/>
+          <w:rFonts w:ascii="Times New Roman" w:eastAsia="SimSun" w:hAnsi="Times New Roman" w:cs="Times New Roman" w:hint="eastAsia"/>
           <w:color w:val="FF0000"/>
           <w:sz w:val="24"/>
         </w:rPr>
@@ -601,7 +589,7 @@
       <w:pPr>
         <w:spacing w:line="360" w:lineRule="auto"/>
         <w:rPr>
-          <w:rFonts w:ascii="Times New Roman" w:eastAsia="宋体" w:hAnsi="Times New Roman" w:cs="Times New Roman"/>
+          <w:rFonts w:ascii="Times New Roman" w:eastAsia="SimSun" w:hAnsi="Times New Roman" w:cs="Times New Roman"/>
           <w:sz w:val="24"/>
         </w:rPr>
       </w:pPr>
@@ -616,13 +604,13 @@
         <w:spacing w:line="360" w:lineRule="auto"/>
         <w:ind w:firstLineChars="0"/>
         <w:rPr>
-          <w:rFonts w:ascii="Times New Roman" w:eastAsia="宋体" w:hAnsi="Times New Roman" w:cs="Times New Roman"/>
-          <w:sz w:val="24"/>
-        </w:rPr>
-      </w:pPr>
-      <w:r>
-        <w:rPr>
-          <w:rFonts w:ascii="Times New Roman" w:eastAsia="宋体" w:hAnsi="Times New Roman" w:cs="Times New Roman" w:hint="eastAsia"/>
+          <w:rFonts w:ascii="Times New Roman" w:eastAsia="SimSun" w:hAnsi="Times New Roman" w:cs="Times New Roman"/>
+          <w:sz w:val="24"/>
+        </w:rPr>
+      </w:pPr>
+      <w:r>
+        <w:rPr>
+          <w:rFonts w:ascii="Times New Roman" w:eastAsia="SimSun" w:hAnsi="Times New Roman" w:cs="Times New Roman" w:hint="eastAsia"/>
           <w:sz w:val="24"/>
         </w:rPr>
         <w:t>设计流程</w:t>
@@ -634,34 +622,34 @@
         <w:spacing w:line="360" w:lineRule="auto"/>
         <w:ind w:left="420" w:firstLineChars="0" w:firstLine="0"/>
         <w:rPr>
-          <w:rFonts w:ascii="Times New Roman" w:eastAsia="宋体" w:hAnsi="Times New Roman" w:cs="Times New Roman"/>
-          <w:sz w:val="24"/>
-        </w:rPr>
-      </w:pPr>
-      <w:r>
-        <w:rPr>
-          <w:rFonts w:ascii="Times New Roman" w:eastAsia="宋体" w:hAnsi="Times New Roman" w:cs="Times New Roman" w:hint="eastAsia"/>
+          <w:rFonts w:ascii="Times New Roman" w:eastAsia="SimSun" w:hAnsi="Times New Roman" w:cs="Times New Roman"/>
+          <w:sz w:val="24"/>
+        </w:rPr>
+      </w:pPr>
+      <w:r>
+        <w:rPr>
+          <w:rFonts w:ascii="Times New Roman" w:eastAsia="SimSun" w:hAnsi="Times New Roman" w:cs="Times New Roman" w:hint="eastAsia"/>
           <w:sz w:val="24"/>
         </w:rPr>
         <w:t>2</w:t>
       </w:r>
       <w:r>
         <w:rPr>
-          <w:rFonts w:ascii="Times New Roman" w:eastAsia="宋体" w:hAnsi="Times New Roman" w:cs="Times New Roman"/>
+          <w:rFonts w:ascii="Times New Roman" w:eastAsia="SimSun" w:hAnsi="Times New Roman" w:cs="Times New Roman"/>
           <w:sz w:val="24"/>
         </w:rPr>
         <w:t>00</w:t>
       </w:r>
       <w:r>
         <w:rPr>
-          <w:rFonts w:ascii="Times New Roman" w:eastAsia="宋体" w:hAnsi="Times New Roman" w:cs="Times New Roman" w:hint="eastAsia"/>
+          <w:rFonts w:ascii="Times New Roman" w:eastAsia="SimSun" w:hAnsi="Times New Roman" w:cs="Times New Roman" w:hint="eastAsia"/>
           <w:sz w:val="24"/>
         </w:rPr>
         <w:t>字内</w:t>
       </w:r>
       <w:r>
         <w:rPr>
-          <w:rFonts w:ascii="Times New Roman" w:eastAsia="宋体" w:hAnsi="Times New Roman" w:cs="Times New Roman" w:hint="eastAsia"/>
+          <w:rFonts w:ascii="Times New Roman" w:eastAsia="SimSun" w:hAnsi="Times New Roman" w:cs="Times New Roman" w:hint="eastAsia"/>
           <w:color w:val="FF0000"/>
           <w:sz w:val="24"/>
         </w:rPr>
@@ -669,7 +657,7 @@
       </w:r>
       <w:r>
         <w:rPr>
-          <w:rFonts w:ascii="Times New Roman" w:eastAsia="宋体" w:hAnsi="Times New Roman" w:cs="Times New Roman" w:hint="eastAsia"/>
+          <w:rFonts w:ascii="Times New Roman" w:eastAsia="SimSun" w:hAnsi="Times New Roman" w:cs="Times New Roman" w:hint="eastAsia"/>
           <w:color w:val="FF0000"/>
           <w:sz w:val="24"/>
         </w:rPr>
@@ -680,23 +668,23 @@
       <w:pPr>
         <w:spacing w:line="360" w:lineRule="auto"/>
         <w:rPr>
-          <w:rFonts w:ascii="Times New Roman" w:eastAsia="宋体" w:hAnsi="Times New Roman" w:cs="Times New Roman"/>
-          <w:sz w:val="24"/>
-        </w:rPr>
-      </w:pPr>
-    </w:p>
-    <w:p>
-      <w:pPr>
-        <w:spacing w:line="360" w:lineRule="auto"/>
-        <w:rPr>
-          <w:rFonts w:ascii="Times New Roman" w:eastAsia="宋体" w:hAnsi="Times New Roman" w:cs="Times New Roman"/>
-          <w:b/>
-          <w:sz w:val="24"/>
-        </w:rPr>
-      </w:pPr>
-      <w:r>
-        <w:rPr>
-          <w:rFonts w:ascii="Times New Roman" w:eastAsia="宋体" w:hAnsi="Times New Roman" w:cs="Times New Roman" w:hint="eastAsia"/>
+          <w:rFonts w:ascii="Times New Roman" w:eastAsia="SimSun" w:hAnsi="Times New Roman" w:cs="Times New Roman"/>
+          <w:sz w:val="24"/>
+        </w:rPr>
+      </w:pPr>
+    </w:p>
+    <w:p>
+      <w:pPr>
+        <w:spacing w:line="360" w:lineRule="auto"/>
+        <w:rPr>
+          <w:rFonts w:ascii="Times New Roman" w:eastAsia="SimSun" w:hAnsi="Times New Roman" w:cs="Times New Roman"/>
+          <w:b/>
+          <w:sz w:val="24"/>
+        </w:rPr>
+      </w:pPr>
+      <w:r>
+        <w:rPr>
+          <w:rFonts w:ascii="Times New Roman" w:eastAsia="SimSun" w:hAnsi="Times New Roman" w:cs="Times New Roman" w:hint="eastAsia"/>
           <w:b/>
           <w:sz w:val="28"/>
         </w:rPr>
@@ -704,7 +692,7 @@
       </w:r>
       <w:r>
         <w:rPr>
-          <w:rFonts w:ascii="Times New Roman" w:eastAsia="宋体" w:hAnsi="Times New Roman" w:cs="Times New Roman" w:hint="eastAsia"/>
+          <w:rFonts w:ascii="Times New Roman" w:eastAsia="SimSun" w:hAnsi="Times New Roman" w:cs="Times New Roman" w:hint="eastAsia"/>
           <w:b/>
           <w:sz w:val="28"/>
         </w:rPr>
@@ -712,7 +700,7 @@
       </w:r>
       <w:r>
         <w:rPr>
-          <w:rFonts w:ascii="Times New Roman" w:eastAsia="宋体" w:hAnsi="Times New Roman" w:cs="Times New Roman" w:hint="eastAsia"/>
+          <w:rFonts w:ascii="Times New Roman" w:eastAsia="SimSun" w:hAnsi="Times New Roman" w:cs="Times New Roman" w:hint="eastAsia"/>
           <w:b/>
           <w:sz w:val="28"/>
         </w:rPr>
@@ -720,7 +708,7 @@
       </w:r>
       <w:r>
         <w:rPr>
-          <w:rFonts w:ascii="Times New Roman" w:eastAsia="宋体" w:hAnsi="Times New Roman" w:cs="Times New Roman" w:hint="eastAsia"/>
+          <w:rFonts w:ascii="Times New Roman" w:eastAsia="SimSun" w:hAnsi="Times New Roman" w:cs="Times New Roman" w:hint="eastAsia"/>
           <w:b/>
           <w:sz w:val="28"/>
         </w:rPr>
@@ -728,7 +716,7 @@
       </w:r>
       <w:r>
         <w:rPr>
-          <w:rFonts w:ascii="Times New Roman" w:eastAsia="宋体" w:hAnsi="Times New Roman" w:cs="Times New Roman"/>
+          <w:rFonts w:ascii="Times New Roman" w:eastAsia="SimSun" w:hAnsi="Times New Roman" w:cs="Times New Roman"/>
           <w:b/>
           <w:sz w:val="28"/>
         </w:rPr>
@@ -736,7 +724,7 @@
       </w:r>
       <w:r>
         <w:rPr>
-          <w:rFonts w:ascii="Times New Roman" w:eastAsia="宋体" w:hAnsi="Times New Roman" w:cs="Times New Roman" w:hint="eastAsia"/>
+          <w:rFonts w:ascii="Times New Roman" w:eastAsia="SimSun" w:hAnsi="Times New Roman" w:cs="Times New Roman" w:hint="eastAsia"/>
           <w:b/>
           <w:sz w:val="24"/>
         </w:rPr>
@@ -748,21 +736,21 @@
         <w:spacing w:line="360" w:lineRule="auto"/>
         <w:ind w:firstLineChars="200" w:firstLine="480"/>
         <w:rPr>
-          <w:rFonts w:ascii="Times New Roman" w:eastAsia="宋体" w:hAnsi="Times New Roman" w:cs="Times New Roman"/>
-          <w:color w:val="FF0000"/>
-          <w:sz w:val="24"/>
-        </w:rPr>
-      </w:pPr>
-      <w:r>
-        <w:rPr>
-          <w:rFonts w:ascii="Times New Roman" w:eastAsia="宋体" w:hAnsi="Times New Roman" w:cs="Times New Roman" w:hint="eastAsia"/>
+          <w:rFonts w:ascii="Times New Roman" w:eastAsia="SimSun" w:hAnsi="Times New Roman" w:cs="Times New Roman"/>
+          <w:color w:val="FF0000"/>
+          <w:sz w:val="24"/>
+        </w:rPr>
+      </w:pPr>
+      <w:r>
+        <w:rPr>
+          <w:rFonts w:ascii="Times New Roman" w:eastAsia="SimSun" w:hAnsi="Times New Roman" w:cs="Times New Roman" w:hint="eastAsia"/>
           <w:sz w:val="24"/>
         </w:rPr>
         <w:t>阐述具体的设计细节</w:t>
       </w:r>
       <w:r>
         <w:rPr>
-          <w:rFonts w:ascii="Times New Roman" w:eastAsia="宋体" w:hAnsi="Times New Roman" w:cs="Times New Roman" w:hint="eastAsia"/>
+          <w:rFonts w:ascii="Times New Roman" w:eastAsia="SimSun" w:hAnsi="Times New Roman" w:cs="Times New Roman" w:hint="eastAsia"/>
           <w:color w:val="FF0000"/>
           <w:sz w:val="24"/>
         </w:rPr>
@@ -779,7 +767,7 @@
         <w:spacing w:line="360" w:lineRule="auto"/>
         <w:ind w:firstLineChars="0"/>
         <w:rPr>
-          <w:rFonts w:ascii="Times New Roman" w:eastAsia="宋体" w:hAnsi="Times New Roman" w:cs="Times New Roman"/>
+          <w:rFonts w:ascii="Times New Roman" w:eastAsia="SimSun" w:hAnsi="Times New Roman" w:cs="Times New Roman"/>
           <w:vanish/>
           <w:sz w:val="24"/>
         </w:rPr>
@@ -795,20 +783,20 @@
         <w:spacing w:line="360" w:lineRule="auto"/>
         <w:ind w:firstLineChars="0"/>
         <w:rPr>
-          <w:rFonts w:ascii="Times New Roman" w:eastAsia="宋体" w:hAnsi="Times New Roman" w:cs="Times New Roman"/>
-          <w:sz w:val="24"/>
-        </w:rPr>
-      </w:pPr>
-      <w:r>
-        <w:rPr>
-          <w:rFonts w:ascii="Times New Roman" w:eastAsia="宋体" w:hAnsi="Times New Roman" w:cs="Times New Roman" w:hint="eastAsia"/>
+          <w:rFonts w:ascii="Times New Roman" w:eastAsia="SimSun" w:hAnsi="Times New Roman" w:cs="Times New Roman"/>
+          <w:sz w:val="24"/>
+        </w:rPr>
+      </w:pPr>
+      <w:r>
+        <w:rPr>
+          <w:rFonts w:ascii="Times New Roman" w:eastAsia="SimSun" w:hAnsi="Times New Roman" w:cs="Times New Roman" w:hint="eastAsia"/>
           <w:sz w:val="24"/>
         </w:rPr>
         <w:t>整体</w:t>
       </w:r>
       <w:r>
         <w:rPr>
-          <w:rFonts w:ascii="Times New Roman" w:eastAsia="宋体" w:hAnsi="Times New Roman" w:cs="Times New Roman" w:hint="eastAsia"/>
+          <w:rFonts w:ascii="Times New Roman" w:eastAsia="SimSun" w:hAnsi="Times New Roman" w:cs="Times New Roman" w:hint="eastAsia"/>
           <w:sz w:val="24"/>
         </w:rPr>
         <w:t>介绍</w:t>
@@ -820,15 +808,16 @@
         <w:spacing w:line="360" w:lineRule="auto"/>
         <w:ind w:left="420" w:firstLineChars="0" w:firstLine="0"/>
         <w:rPr>
-          <w:rFonts w:ascii="Times New Roman" w:eastAsia="宋体" w:hAnsi="Times New Roman" w:cs="Times New Roman"/>
-          <w:sz w:val="24"/>
-        </w:rPr>
-      </w:pPr>
-      <w:r>
-        <w:rPr>
-          <w:rFonts w:ascii="Times New Roman" w:eastAsia="宋体" w:hAnsi="Times New Roman" w:cs="Times New Roman" w:hint="eastAsia"/>
-          <w:sz w:val="24"/>
-        </w:rPr>
+          <w:rFonts w:ascii="Times New Roman" w:eastAsia="SimSun" w:hAnsi="Times New Roman" w:cs="Times New Roman"/>
+          <w:sz w:val="24"/>
+        </w:rPr>
+      </w:pPr>
+      <w:r>
+        <w:rPr>
+          <w:rFonts w:ascii="Times New Roman" w:eastAsia="SimSun" w:hAnsi="Times New Roman" w:cs="Times New Roman" w:hint="eastAsia"/>
+          <w:sz w:val="24"/>
+        </w:rPr>
+        <w:lastRenderedPageBreak/>
         <w:t>给出系统整体框图，各子模块标注清楚，并进行整体的文字说明，需要表达出各模块之间的关系。</w:t>
       </w:r>
     </w:p>
@@ -838,7 +827,7 @@
         <w:spacing w:line="360" w:lineRule="auto"/>
         <w:ind w:left="420" w:firstLineChars="0" w:firstLine="0"/>
         <w:rPr>
-          <w:rFonts w:ascii="Times New Roman" w:eastAsia="宋体" w:hAnsi="Times New Roman" w:cs="Times New Roman"/>
+          <w:rFonts w:ascii="Times New Roman" w:eastAsia="SimSun" w:hAnsi="Times New Roman" w:cs="Times New Roman"/>
           <w:sz w:val="24"/>
         </w:rPr>
       </w:pPr>
@@ -853,20 +842,20 @@
         <w:spacing w:line="360" w:lineRule="auto"/>
         <w:ind w:firstLineChars="0"/>
         <w:rPr>
-          <w:rFonts w:ascii="Times New Roman" w:eastAsia="宋体" w:hAnsi="Times New Roman" w:cs="Times New Roman"/>
-          <w:sz w:val="24"/>
-        </w:rPr>
-      </w:pPr>
-      <w:r>
-        <w:rPr>
-          <w:rFonts w:ascii="Times New Roman" w:eastAsia="宋体" w:hAnsi="Times New Roman" w:cs="Times New Roman" w:hint="eastAsia"/>
+          <w:rFonts w:ascii="Times New Roman" w:eastAsia="SimSun" w:hAnsi="Times New Roman" w:cs="Times New Roman"/>
+          <w:sz w:val="24"/>
+        </w:rPr>
+      </w:pPr>
+      <w:r>
+        <w:rPr>
+          <w:rFonts w:ascii="Times New Roman" w:eastAsia="SimSun" w:hAnsi="Times New Roman" w:cs="Times New Roman" w:hint="eastAsia"/>
           <w:sz w:val="24"/>
         </w:rPr>
         <w:t>硬件系统</w:t>
       </w:r>
       <w:r>
         <w:rPr>
-          <w:rFonts w:ascii="Times New Roman" w:eastAsia="宋体" w:hAnsi="Times New Roman" w:cs="Times New Roman" w:hint="eastAsia"/>
+          <w:rFonts w:ascii="Times New Roman" w:eastAsia="SimSun" w:hAnsi="Times New Roman" w:cs="Times New Roman" w:hint="eastAsia"/>
           <w:sz w:val="24"/>
         </w:rPr>
         <w:t>介绍</w:t>
@@ -878,34 +867,34 @@
         <w:spacing w:line="360" w:lineRule="auto"/>
         <w:ind w:left="420" w:firstLineChars="0" w:firstLine="0"/>
         <w:rPr>
-          <w:rFonts w:ascii="Times New Roman" w:eastAsia="宋体" w:hAnsi="Times New Roman" w:cs="Times New Roman"/>
-          <w:sz w:val="24"/>
-        </w:rPr>
-      </w:pPr>
-      <w:r>
-        <w:rPr>
-          <w:rFonts w:ascii="Times New Roman" w:eastAsia="宋体" w:hAnsi="Times New Roman" w:cs="Times New Roman" w:hint="eastAsia"/>
+          <w:rFonts w:ascii="Times New Roman" w:eastAsia="SimSun" w:hAnsi="Times New Roman" w:cs="Times New Roman"/>
+          <w:sz w:val="24"/>
+        </w:rPr>
+      </w:pPr>
+      <w:r>
+        <w:rPr>
+          <w:rFonts w:ascii="Times New Roman" w:eastAsia="SimSun" w:hAnsi="Times New Roman" w:cs="Times New Roman" w:hint="eastAsia"/>
           <w:sz w:val="24"/>
         </w:rPr>
         <w:t>2.2.1</w:t>
       </w:r>
       <w:r>
         <w:rPr>
-          <w:rFonts w:ascii="Times New Roman" w:eastAsia="宋体" w:hAnsi="Times New Roman" w:cs="Times New Roman"/>
+          <w:rFonts w:ascii="Times New Roman" w:eastAsia="SimSun" w:hAnsi="Times New Roman" w:cs="Times New Roman"/>
           <w:sz w:val="24"/>
         </w:rPr>
         <w:t xml:space="preserve"> </w:t>
       </w:r>
       <w:r>
         <w:rPr>
-          <w:rFonts w:ascii="Times New Roman" w:eastAsia="宋体" w:hAnsi="Times New Roman" w:cs="Times New Roman" w:hint="eastAsia"/>
+          <w:rFonts w:ascii="Times New Roman" w:eastAsia="SimSun" w:hAnsi="Times New Roman" w:cs="Times New Roman" w:hint="eastAsia"/>
           <w:sz w:val="24"/>
         </w:rPr>
         <w:t>硬件整体介绍</w:t>
       </w:r>
       <w:r>
         <w:rPr>
-          <w:rFonts w:ascii="Times New Roman" w:eastAsia="宋体" w:hAnsi="Times New Roman" w:cs="Times New Roman" w:hint="eastAsia"/>
+          <w:rFonts w:ascii="Times New Roman" w:eastAsia="SimSun" w:hAnsi="Times New Roman" w:cs="Times New Roman" w:hint="eastAsia"/>
           <w:sz w:val="24"/>
         </w:rPr>
         <w:t>；</w:t>
@@ -917,62 +906,62 @@
         <w:spacing w:line="360" w:lineRule="auto"/>
         <w:ind w:left="420" w:firstLineChars="0" w:firstLine="0"/>
         <w:rPr>
-          <w:rFonts w:ascii="Times New Roman" w:eastAsia="宋体" w:hAnsi="Times New Roman" w:cs="Times New Roman"/>
-          <w:sz w:val="24"/>
-        </w:rPr>
-      </w:pPr>
-      <w:r>
-        <w:rPr>
-          <w:rFonts w:ascii="Times New Roman" w:eastAsia="宋体" w:hAnsi="Times New Roman" w:cs="Times New Roman" w:hint="eastAsia"/>
+          <w:rFonts w:ascii="Times New Roman" w:eastAsia="SimSun" w:hAnsi="Times New Roman" w:cs="Times New Roman"/>
+          <w:sz w:val="24"/>
+        </w:rPr>
+      </w:pPr>
+      <w:r>
+        <w:rPr>
+          <w:rFonts w:ascii="Times New Roman" w:eastAsia="SimSun" w:hAnsi="Times New Roman" w:cs="Times New Roman" w:hint="eastAsia"/>
           <w:sz w:val="24"/>
         </w:rPr>
         <w:t>2.2.2</w:t>
       </w:r>
       <w:r>
         <w:rPr>
-          <w:rFonts w:ascii="Times New Roman" w:eastAsia="宋体" w:hAnsi="Times New Roman" w:cs="Times New Roman"/>
+          <w:rFonts w:ascii="Times New Roman" w:eastAsia="SimSun" w:hAnsi="Times New Roman" w:cs="Times New Roman"/>
           <w:sz w:val="24"/>
         </w:rPr>
         <w:t xml:space="preserve"> </w:t>
       </w:r>
       <w:r>
         <w:rPr>
-          <w:rFonts w:ascii="Times New Roman" w:eastAsia="宋体" w:hAnsi="Times New Roman" w:cs="Times New Roman" w:hint="eastAsia"/>
+          <w:rFonts w:ascii="Times New Roman" w:eastAsia="SimSun" w:hAnsi="Times New Roman" w:cs="Times New Roman" w:hint="eastAsia"/>
           <w:sz w:val="24"/>
         </w:rPr>
         <w:t>机械设计介绍（如果有的话</w:t>
       </w:r>
       <w:r>
         <w:rPr>
-          <w:rFonts w:ascii="Times New Roman" w:eastAsia="宋体" w:hAnsi="Times New Roman" w:cs="Times New Roman" w:hint="eastAsia"/>
+          <w:rFonts w:ascii="Times New Roman" w:eastAsia="SimSun" w:hAnsi="Times New Roman" w:cs="Times New Roman" w:hint="eastAsia"/>
           <w:sz w:val="24"/>
         </w:rPr>
         <w:t>，从总体到局部，</w:t>
       </w:r>
       <w:r>
         <w:rPr>
-          <w:rFonts w:ascii="Times New Roman" w:eastAsia="宋体" w:hAnsi="Times New Roman" w:cs="Times New Roman" w:hint="eastAsia"/>
+          <w:rFonts w:ascii="Times New Roman" w:eastAsia="SimSun" w:hAnsi="Times New Roman" w:cs="Times New Roman" w:hint="eastAsia"/>
           <w:sz w:val="24"/>
         </w:rPr>
         <w:t>逐级</w:t>
       </w:r>
       <w:r>
         <w:rPr>
-          <w:rFonts w:ascii="Times New Roman" w:eastAsia="宋体" w:hAnsi="Times New Roman" w:cs="Times New Roman" w:hint="eastAsia"/>
+          <w:rFonts w:ascii="Times New Roman" w:eastAsia="SimSun" w:hAnsi="Times New Roman" w:cs="Times New Roman" w:hint="eastAsia"/>
           <w:sz w:val="24"/>
         </w:rPr>
         <w:t>给出各组件的具体</w:t>
       </w:r>
       <w:r>
         <w:rPr>
-          <w:rFonts w:ascii="Times New Roman" w:eastAsia="宋体" w:hAnsi="Times New Roman" w:cs="Times New Roman" w:hint="eastAsia"/>
+          <w:rFonts w:ascii="Times New Roman" w:eastAsia="SimSun" w:hAnsi="Times New Roman" w:cs="Times New Roman" w:hint="eastAsia"/>
           <w:sz w:val="24"/>
         </w:rPr>
         <w:t>设计图，</w:t>
       </w:r>
       <w:r>
         <w:rPr>
-          <w:rFonts w:ascii="Times New Roman" w:eastAsia="宋体" w:hAnsi="Times New Roman" w:cs="Times New Roman" w:hint="eastAsia"/>
+          <w:rFonts w:ascii="Times New Roman" w:eastAsia="SimSun" w:hAnsi="Times New Roman" w:cs="Times New Roman" w:hint="eastAsia"/>
           <w:color w:val="FF0000"/>
           <w:sz w:val="24"/>
         </w:rPr>
@@ -980,7 +969,7 @@
       </w:r>
       <w:r>
         <w:rPr>
-          <w:rFonts w:ascii="Times New Roman" w:eastAsia="宋体" w:hAnsi="Times New Roman" w:cs="Times New Roman" w:hint="eastAsia"/>
+          <w:rFonts w:ascii="Times New Roman" w:eastAsia="SimSun" w:hAnsi="Times New Roman" w:cs="Times New Roman" w:hint="eastAsia"/>
           <w:color w:val="FF0000"/>
           <w:sz w:val="24"/>
         </w:rPr>
@@ -988,7 +977,7 @@
       </w:r>
       <w:r>
         <w:rPr>
-          <w:rFonts w:ascii="Times New Roman" w:eastAsia="宋体" w:hAnsi="Times New Roman" w:cs="Times New Roman" w:hint="eastAsia"/>
+          <w:rFonts w:ascii="Times New Roman" w:eastAsia="SimSun" w:hAnsi="Times New Roman" w:cs="Times New Roman" w:hint="eastAsia"/>
           <w:color w:val="FF0000"/>
           <w:sz w:val="24"/>
         </w:rPr>
@@ -996,14 +985,14 @@
       </w:r>
       <w:r>
         <w:rPr>
-          <w:rFonts w:ascii="Times New Roman" w:eastAsia="宋体" w:hAnsi="Times New Roman" w:cs="Times New Roman" w:hint="eastAsia"/>
+          <w:rFonts w:ascii="Times New Roman" w:eastAsia="SimSun" w:hAnsi="Times New Roman" w:cs="Times New Roman" w:hint="eastAsia"/>
           <w:sz w:val="24"/>
         </w:rPr>
         <w:t>）</w:t>
       </w:r>
       <w:r>
         <w:rPr>
-          <w:rFonts w:ascii="Times New Roman" w:eastAsia="宋体" w:hAnsi="Times New Roman" w:cs="Times New Roman" w:hint="eastAsia"/>
+          <w:rFonts w:ascii="Times New Roman" w:eastAsia="SimSun" w:hAnsi="Times New Roman" w:cs="Times New Roman" w:hint="eastAsia"/>
           <w:sz w:val="24"/>
         </w:rPr>
         <w:t>；</w:t>
@@ -1014,97 +1003,97 @@
         <w:spacing w:line="360" w:lineRule="auto"/>
         <w:ind w:firstLine="420"/>
         <w:rPr>
-          <w:rFonts w:ascii="Times New Roman" w:eastAsia="宋体" w:hAnsi="Times New Roman" w:cs="Times New Roman"/>
-          <w:sz w:val="24"/>
-        </w:rPr>
-      </w:pPr>
-      <w:r>
-        <w:rPr>
-          <w:rFonts w:ascii="Times New Roman" w:eastAsia="宋体" w:hAnsi="Times New Roman" w:cs="Times New Roman" w:hint="eastAsia"/>
+          <w:rFonts w:ascii="Times New Roman" w:eastAsia="SimSun" w:hAnsi="Times New Roman" w:cs="Times New Roman"/>
+          <w:sz w:val="24"/>
+        </w:rPr>
+      </w:pPr>
+      <w:r>
+        <w:rPr>
+          <w:rFonts w:ascii="Times New Roman" w:eastAsia="SimSun" w:hAnsi="Times New Roman" w:cs="Times New Roman" w:hint="eastAsia"/>
           <w:sz w:val="24"/>
         </w:rPr>
         <w:t>2.2.3</w:t>
       </w:r>
       <w:r>
         <w:rPr>
-          <w:rFonts w:ascii="Times New Roman" w:eastAsia="宋体" w:hAnsi="Times New Roman" w:cs="Times New Roman"/>
+          <w:rFonts w:ascii="Times New Roman" w:eastAsia="SimSun" w:hAnsi="Times New Roman" w:cs="Times New Roman"/>
           <w:sz w:val="24"/>
         </w:rPr>
         <w:t xml:space="preserve"> </w:t>
       </w:r>
       <w:r>
         <w:rPr>
-          <w:rFonts w:ascii="Times New Roman" w:eastAsia="宋体" w:hAnsi="Times New Roman" w:cs="Times New Roman" w:hint="eastAsia"/>
+          <w:rFonts w:ascii="Times New Roman" w:eastAsia="SimSun" w:hAnsi="Times New Roman" w:cs="Times New Roman" w:hint="eastAsia"/>
           <w:sz w:val="24"/>
         </w:rPr>
         <w:t>电路</w:t>
       </w:r>
       <w:r>
         <w:rPr>
-          <w:rFonts w:ascii="Times New Roman" w:eastAsia="宋体" w:hAnsi="Times New Roman" w:cs="Times New Roman" w:hint="eastAsia"/>
+          <w:rFonts w:ascii="Times New Roman" w:eastAsia="SimSun" w:hAnsi="Times New Roman" w:cs="Times New Roman" w:hint="eastAsia"/>
           <w:sz w:val="24"/>
         </w:rPr>
         <w:t>各模块介绍（</w:t>
       </w:r>
       <w:r>
         <w:rPr>
-          <w:rFonts w:ascii="Times New Roman" w:eastAsia="宋体" w:hAnsi="Times New Roman" w:cs="Times New Roman" w:hint="eastAsia"/>
+          <w:rFonts w:ascii="Times New Roman" w:eastAsia="SimSun" w:hAnsi="Times New Roman" w:cs="Times New Roman" w:hint="eastAsia"/>
           <w:sz w:val="24"/>
         </w:rPr>
         <w:t>从</w:t>
       </w:r>
       <w:r>
         <w:rPr>
-          <w:rFonts w:ascii="Times New Roman" w:eastAsia="宋体" w:hAnsi="Times New Roman" w:cs="Times New Roman" w:hint="eastAsia"/>
+          <w:rFonts w:ascii="Times New Roman" w:eastAsia="SimSun" w:hAnsi="Times New Roman" w:cs="Times New Roman" w:hint="eastAsia"/>
           <w:sz w:val="24"/>
         </w:rPr>
         <w:t>总体</w:t>
       </w:r>
       <w:r>
         <w:rPr>
-          <w:rFonts w:ascii="Times New Roman" w:eastAsia="宋体" w:hAnsi="Times New Roman" w:cs="Times New Roman" w:hint="eastAsia"/>
+          <w:rFonts w:ascii="Times New Roman" w:eastAsia="SimSun" w:hAnsi="Times New Roman" w:cs="Times New Roman" w:hint="eastAsia"/>
           <w:sz w:val="24"/>
         </w:rPr>
         <w:t>到局部</w:t>
       </w:r>
       <w:r>
         <w:rPr>
-          <w:rFonts w:ascii="Times New Roman" w:eastAsia="宋体" w:hAnsi="Times New Roman" w:cs="Times New Roman" w:hint="eastAsia"/>
+          <w:rFonts w:ascii="Times New Roman" w:eastAsia="SimSun" w:hAnsi="Times New Roman" w:cs="Times New Roman" w:hint="eastAsia"/>
           <w:sz w:val="24"/>
         </w:rPr>
         <w:t>，</w:t>
       </w:r>
       <w:r>
         <w:rPr>
-          <w:rFonts w:ascii="Times New Roman" w:eastAsia="宋体" w:hAnsi="Times New Roman" w:cs="Times New Roman" w:hint="eastAsia"/>
+          <w:rFonts w:ascii="Times New Roman" w:eastAsia="SimSun" w:hAnsi="Times New Roman" w:cs="Times New Roman" w:hint="eastAsia"/>
           <w:sz w:val="24"/>
         </w:rPr>
         <w:t>逐级</w:t>
       </w:r>
       <w:r>
         <w:rPr>
-          <w:rFonts w:ascii="Times New Roman" w:eastAsia="宋体" w:hAnsi="Times New Roman" w:cs="Times New Roman" w:hint="eastAsia"/>
+          <w:rFonts w:ascii="Times New Roman" w:eastAsia="SimSun" w:hAnsi="Times New Roman" w:cs="Times New Roman" w:hint="eastAsia"/>
           <w:sz w:val="24"/>
         </w:rPr>
         <w:t>给出各模块的具体设计</w:t>
       </w:r>
       <w:r>
         <w:rPr>
-          <w:rFonts w:ascii="Times New Roman" w:eastAsia="宋体" w:hAnsi="Times New Roman" w:cs="Times New Roman" w:hint="eastAsia"/>
+          <w:rFonts w:ascii="Times New Roman" w:eastAsia="SimSun" w:hAnsi="Times New Roman" w:cs="Times New Roman" w:hint="eastAsia"/>
           <w:sz w:val="24"/>
         </w:rPr>
         <w:t>图</w:t>
       </w:r>
       <w:r>
         <w:rPr>
-          <w:rFonts w:ascii="Times New Roman" w:eastAsia="宋体" w:hAnsi="Times New Roman" w:cs="Times New Roman" w:hint="eastAsia"/>
+          <w:rFonts w:ascii="Times New Roman" w:eastAsia="SimSun" w:hAnsi="Times New Roman" w:cs="Times New Roman" w:hint="eastAsia"/>
           <w:sz w:val="24"/>
         </w:rPr>
         <w:t>，并标记出关键的输入、输出信号线，</w:t>
       </w:r>
       <w:r>
         <w:rPr>
-          <w:rFonts w:ascii="Times New Roman" w:eastAsia="宋体" w:hAnsi="Times New Roman" w:cs="Times New Roman" w:hint="eastAsia"/>
+          <w:rFonts w:ascii="Times New Roman" w:eastAsia="SimSun" w:hAnsi="Times New Roman" w:cs="Times New Roman" w:hint="eastAsia"/>
           <w:color w:val="FF0000"/>
           <w:sz w:val="24"/>
         </w:rPr>
@@ -1112,7 +1101,7 @@
       </w:r>
       <w:r>
         <w:rPr>
-          <w:rFonts w:ascii="Times New Roman" w:eastAsia="宋体" w:hAnsi="Times New Roman" w:cs="Times New Roman" w:hint="eastAsia"/>
+          <w:rFonts w:ascii="Times New Roman" w:eastAsia="SimSun" w:hAnsi="Times New Roman" w:cs="Times New Roman" w:hint="eastAsia"/>
           <w:color w:val="FF0000"/>
           <w:sz w:val="24"/>
         </w:rPr>
@@ -1120,7 +1109,7 @@
       </w:r>
       <w:r>
         <w:rPr>
-          <w:rFonts w:ascii="Times New Roman" w:eastAsia="宋体" w:hAnsi="Times New Roman" w:cs="Times New Roman" w:hint="eastAsia"/>
+          <w:rFonts w:ascii="Times New Roman" w:eastAsia="SimSun" w:hAnsi="Times New Roman" w:cs="Times New Roman" w:hint="eastAsia"/>
           <w:color w:val="FF0000"/>
           <w:sz w:val="24"/>
         </w:rPr>
@@ -1128,7 +1117,7 @@
       </w:r>
       <w:r>
         <w:rPr>
-          <w:rFonts w:ascii="Times New Roman" w:eastAsia="宋体" w:hAnsi="Times New Roman" w:cs="Times New Roman" w:hint="eastAsia"/>
+          <w:rFonts w:ascii="Times New Roman" w:eastAsia="SimSun" w:hAnsi="Times New Roman" w:cs="Times New Roman" w:hint="eastAsia"/>
           <w:color w:val="FF0000"/>
           <w:sz w:val="24"/>
         </w:rPr>
@@ -1136,7 +1125,7 @@
       </w:r>
       <w:r>
         <w:rPr>
-          <w:rFonts w:ascii="Times New Roman" w:eastAsia="宋体" w:hAnsi="Times New Roman" w:cs="Times New Roman" w:hint="eastAsia"/>
+          <w:rFonts w:ascii="Times New Roman" w:eastAsia="SimSun" w:hAnsi="Times New Roman" w:cs="Times New Roman" w:hint="eastAsia"/>
           <w:color w:val="FF0000"/>
           <w:sz w:val="24"/>
         </w:rPr>
@@ -1144,7 +1133,7 @@
       </w:r>
       <w:r>
         <w:rPr>
-          <w:rFonts w:ascii="Times New Roman" w:eastAsia="宋体" w:hAnsi="Times New Roman" w:cs="Times New Roman" w:hint="eastAsia"/>
+          <w:rFonts w:ascii="Times New Roman" w:eastAsia="SimSun" w:hAnsi="Times New Roman" w:cs="Times New Roman" w:hint="eastAsia"/>
           <w:color w:val="FF0000"/>
           <w:sz w:val="24"/>
         </w:rPr>
@@ -1152,7 +1141,7 @@
       </w:r>
       <w:r>
         <w:rPr>
-          <w:rFonts w:ascii="Times New Roman" w:eastAsia="宋体" w:hAnsi="Times New Roman" w:cs="Times New Roman" w:hint="eastAsia"/>
+          <w:rFonts w:ascii="Times New Roman" w:eastAsia="SimSun" w:hAnsi="Times New Roman" w:cs="Times New Roman" w:hint="eastAsia"/>
           <w:color w:val="FF0000"/>
           <w:sz w:val="24"/>
         </w:rPr>
@@ -1160,14 +1149,14 @@
       </w:r>
       <w:r>
         <w:rPr>
-          <w:rFonts w:ascii="Times New Roman" w:eastAsia="宋体" w:hAnsi="Times New Roman" w:cs="Times New Roman" w:hint="eastAsia"/>
+          <w:rFonts w:ascii="Times New Roman" w:eastAsia="SimSun" w:hAnsi="Times New Roman" w:cs="Times New Roman" w:hint="eastAsia"/>
           <w:sz w:val="24"/>
         </w:rPr>
         <w:t>）</w:t>
       </w:r>
       <w:r>
         <w:rPr>
-          <w:rFonts w:ascii="Times New Roman" w:eastAsia="宋体" w:hAnsi="Times New Roman" w:cs="Times New Roman" w:hint="eastAsia"/>
+          <w:rFonts w:ascii="Times New Roman" w:eastAsia="SimSun" w:hAnsi="Times New Roman" w:cs="Times New Roman" w:hint="eastAsia"/>
           <w:sz w:val="24"/>
         </w:rPr>
         <w:t>；</w:t>
@@ -1177,7 +1166,7 @@
       <w:pPr>
         <w:spacing w:line="360" w:lineRule="auto"/>
         <w:rPr>
-          <w:rFonts w:ascii="Times New Roman" w:eastAsia="宋体" w:hAnsi="Times New Roman" w:cs="Times New Roman"/>
+          <w:rFonts w:ascii="Times New Roman" w:eastAsia="SimSun" w:hAnsi="Times New Roman" w:cs="Times New Roman"/>
           <w:sz w:val="24"/>
         </w:rPr>
       </w:pPr>
@@ -1192,13 +1181,13 @@
         <w:spacing w:line="360" w:lineRule="auto"/>
         <w:ind w:firstLineChars="0"/>
         <w:rPr>
-          <w:rFonts w:ascii="Times New Roman" w:eastAsia="宋体" w:hAnsi="Times New Roman" w:cs="Times New Roman"/>
-          <w:sz w:val="24"/>
-        </w:rPr>
-      </w:pPr>
-      <w:r>
-        <w:rPr>
-          <w:rFonts w:ascii="Times New Roman" w:eastAsia="宋体" w:hAnsi="Times New Roman" w:cs="Times New Roman" w:hint="eastAsia"/>
+          <w:rFonts w:ascii="Times New Roman" w:eastAsia="SimSun" w:hAnsi="Times New Roman" w:cs="Times New Roman"/>
+          <w:sz w:val="24"/>
+        </w:rPr>
+      </w:pPr>
+      <w:r>
+        <w:rPr>
+          <w:rFonts w:ascii="Times New Roman" w:eastAsia="SimSun" w:hAnsi="Times New Roman" w:cs="Times New Roman" w:hint="eastAsia"/>
           <w:sz w:val="24"/>
         </w:rPr>
         <w:t>软件系统介绍</w:t>
@@ -1210,55 +1199,55 @@
         <w:spacing w:line="360" w:lineRule="auto"/>
         <w:ind w:left="420" w:firstLineChars="0" w:firstLine="0"/>
         <w:rPr>
-          <w:rFonts w:ascii="Times New Roman" w:eastAsia="宋体" w:hAnsi="Times New Roman" w:cs="Times New Roman"/>
-          <w:sz w:val="24"/>
-        </w:rPr>
-      </w:pPr>
-      <w:r>
-        <w:rPr>
-          <w:rFonts w:ascii="Times New Roman" w:eastAsia="宋体" w:hAnsi="Times New Roman" w:cs="Times New Roman" w:hint="eastAsia"/>
+          <w:rFonts w:ascii="Times New Roman" w:eastAsia="SimSun" w:hAnsi="Times New Roman" w:cs="Times New Roman"/>
+          <w:sz w:val="24"/>
+        </w:rPr>
+      </w:pPr>
+      <w:r>
+        <w:rPr>
+          <w:rFonts w:ascii="Times New Roman" w:eastAsia="SimSun" w:hAnsi="Times New Roman" w:cs="Times New Roman" w:hint="eastAsia"/>
           <w:sz w:val="24"/>
         </w:rPr>
         <w:t>2.3.1</w:t>
       </w:r>
       <w:r>
         <w:rPr>
-          <w:rFonts w:ascii="Times New Roman" w:eastAsia="宋体" w:hAnsi="Times New Roman" w:cs="Times New Roman"/>
+          <w:rFonts w:ascii="Times New Roman" w:eastAsia="SimSun" w:hAnsi="Times New Roman" w:cs="Times New Roman"/>
           <w:sz w:val="24"/>
         </w:rPr>
         <w:t xml:space="preserve"> </w:t>
       </w:r>
       <w:r>
         <w:rPr>
-          <w:rFonts w:ascii="Times New Roman" w:eastAsia="宋体" w:hAnsi="Times New Roman" w:cs="Times New Roman" w:hint="eastAsia"/>
+          <w:rFonts w:ascii="Times New Roman" w:eastAsia="SimSun" w:hAnsi="Times New Roman" w:cs="Times New Roman" w:hint="eastAsia"/>
           <w:sz w:val="24"/>
         </w:rPr>
         <w:t>软件整体介绍（含</w:t>
       </w:r>
       <w:r>
         <w:rPr>
-          <w:rFonts w:ascii="Times New Roman" w:eastAsia="宋体" w:hAnsi="Times New Roman" w:cs="Times New Roman" w:hint="eastAsia"/>
+          <w:rFonts w:ascii="Times New Roman" w:eastAsia="SimSun" w:hAnsi="Times New Roman" w:cs="Times New Roman" w:hint="eastAsia"/>
           <w:sz w:val="24"/>
         </w:rPr>
         <w:t>PC</w:t>
       </w:r>
       <w:r>
         <w:rPr>
-          <w:rFonts w:ascii="Times New Roman" w:eastAsia="宋体" w:hAnsi="Times New Roman" w:cs="Times New Roman" w:hint="eastAsia"/>
+          <w:rFonts w:ascii="Times New Roman" w:eastAsia="SimSun" w:hAnsi="Times New Roman" w:cs="Times New Roman" w:hint="eastAsia"/>
           <w:sz w:val="24"/>
         </w:rPr>
         <w:t>端或云端</w:t>
       </w:r>
       <w:r>
         <w:rPr>
-          <w:rFonts w:ascii="Times New Roman" w:eastAsia="宋体" w:hAnsi="Times New Roman" w:cs="Times New Roman" w:hint="eastAsia"/>
+          <w:rFonts w:ascii="Times New Roman" w:eastAsia="SimSun" w:hAnsi="Times New Roman" w:cs="Times New Roman" w:hint="eastAsia"/>
           <w:sz w:val="24"/>
         </w:rPr>
         <w:t>，结合</w:t>
       </w:r>
       <w:r>
         <w:rPr>
-          <w:rFonts w:ascii="Times New Roman" w:eastAsia="宋体" w:hAnsi="Times New Roman" w:cs="Times New Roman" w:hint="eastAsia"/>
+          <w:rFonts w:ascii="Times New Roman" w:eastAsia="SimSun" w:hAnsi="Times New Roman" w:cs="Times New Roman" w:hint="eastAsia"/>
           <w:color w:val="FF0000"/>
           <w:sz w:val="24"/>
         </w:rPr>
@@ -1266,14 +1255,14 @@
       </w:r>
       <w:r>
         <w:rPr>
-          <w:rFonts w:ascii="Times New Roman" w:eastAsia="宋体" w:hAnsi="Times New Roman" w:cs="Times New Roman" w:hint="eastAsia"/>
+          <w:rFonts w:ascii="Times New Roman" w:eastAsia="SimSun" w:hAnsi="Times New Roman" w:cs="Times New Roman" w:hint="eastAsia"/>
           <w:sz w:val="24"/>
         </w:rPr>
         <w:t>）</w:t>
       </w:r>
       <w:r>
         <w:rPr>
-          <w:rFonts w:ascii="Times New Roman" w:eastAsia="宋体" w:hAnsi="Times New Roman" w:cs="Times New Roman" w:hint="eastAsia"/>
+          <w:rFonts w:ascii="Times New Roman" w:eastAsia="SimSun" w:hAnsi="Times New Roman" w:cs="Times New Roman" w:hint="eastAsia"/>
           <w:sz w:val="24"/>
         </w:rPr>
         <w:t>；</w:t>
@@ -1284,62 +1273,62 @@
         <w:spacing w:line="360" w:lineRule="auto"/>
         <w:ind w:firstLine="420"/>
         <w:rPr>
-          <w:rFonts w:ascii="Times New Roman" w:eastAsia="宋体" w:hAnsi="Times New Roman" w:cs="Times New Roman"/>
-          <w:sz w:val="24"/>
-        </w:rPr>
-      </w:pPr>
-      <w:r>
-        <w:rPr>
-          <w:rFonts w:ascii="Times New Roman" w:eastAsia="宋体" w:hAnsi="Times New Roman" w:cs="Times New Roman" w:hint="eastAsia"/>
+          <w:rFonts w:ascii="Times New Roman" w:eastAsia="SimSun" w:hAnsi="Times New Roman" w:cs="Times New Roman"/>
+          <w:sz w:val="24"/>
+        </w:rPr>
+      </w:pPr>
+      <w:r>
+        <w:rPr>
+          <w:rFonts w:ascii="Times New Roman" w:eastAsia="SimSun" w:hAnsi="Times New Roman" w:cs="Times New Roman" w:hint="eastAsia"/>
           <w:sz w:val="24"/>
         </w:rPr>
         <w:t>2.3.2</w:t>
       </w:r>
       <w:r>
         <w:rPr>
-          <w:rFonts w:ascii="Times New Roman" w:eastAsia="宋体" w:hAnsi="Times New Roman" w:cs="Times New Roman"/>
+          <w:rFonts w:ascii="Times New Roman" w:eastAsia="SimSun" w:hAnsi="Times New Roman" w:cs="Times New Roman"/>
           <w:sz w:val="24"/>
         </w:rPr>
         <w:t xml:space="preserve"> </w:t>
       </w:r>
       <w:r>
         <w:rPr>
-          <w:rFonts w:ascii="Times New Roman" w:eastAsia="宋体" w:hAnsi="Times New Roman" w:cs="Times New Roman" w:hint="eastAsia"/>
+          <w:rFonts w:ascii="Times New Roman" w:eastAsia="SimSun" w:hAnsi="Times New Roman" w:cs="Times New Roman" w:hint="eastAsia"/>
           <w:sz w:val="24"/>
         </w:rPr>
         <w:t>软件各模块介绍（根据总体框图，给出各模块的具体设计说明</w:t>
       </w:r>
       <w:r>
         <w:rPr>
-          <w:rFonts w:ascii="Times New Roman" w:eastAsia="宋体" w:hAnsi="Times New Roman" w:cs="Times New Roman" w:hint="eastAsia"/>
+          <w:rFonts w:ascii="Times New Roman" w:eastAsia="SimSun" w:hAnsi="Times New Roman" w:cs="Times New Roman" w:hint="eastAsia"/>
           <w:sz w:val="24"/>
         </w:rPr>
         <w:t>。从顶层到底层逐次给出</w:t>
       </w:r>
       <w:r>
         <w:rPr>
-          <w:rFonts w:ascii="Times New Roman" w:eastAsia="宋体" w:hAnsi="Times New Roman" w:cs="Times New Roman" w:hint="eastAsia"/>
+          <w:rFonts w:ascii="Times New Roman" w:eastAsia="SimSun" w:hAnsi="Times New Roman" w:cs="Times New Roman" w:hint="eastAsia"/>
           <w:sz w:val="24"/>
         </w:rPr>
         <w:t>各函数的流程图及其关键</w:t>
       </w:r>
       <w:r>
         <w:rPr>
-          <w:rFonts w:ascii="Times New Roman" w:eastAsia="宋体" w:hAnsi="Times New Roman" w:cs="Times New Roman" w:hint="eastAsia"/>
+          <w:rFonts w:ascii="Times New Roman" w:eastAsia="SimSun" w:hAnsi="Times New Roman" w:cs="Times New Roman" w:hint="eastAsia"/>
           <w:sz w:val="24"/>
         </w:rPr>
         <w:t>输入、输出变量</w:t>
       </w:r>
       <w:r>
         <w:rPr>
-          <w:rFonts w:ascii="Times New Roman" w:eastAsia="宋体" w:hAnsi="Times New Roman" w:cs="Times New Roman" w:hint="eastAsia"/>
+          <w:rFonts w:ascii="Times New Roman" w:eastAsia="SimSun" w:hAnsi="Times New Roman" w:cs="Times New Roman" w:hint="eastAsia"/>
           <w:sz w:val="24"/>
         </w:rPr>
         <w:t>）</w:t>
       </w:r>
       <w:r>
         <w:rPr>
-          <w:rFonts w:ascii="Times New Roman" w:eastAsia="宋体" w:hAnsi="Times New Roman" w:cs="Times New Roman" w:hint="eastAsia"/>
+          <w:rFonts w:ascii="Times New Roman" w:eastAsia="SimSun" w:hAnsi="Times New Roman" w:cs="Times New Roman" w:hint="eastAsia"/>
           <w:sz w:val="24"/>
         </w:rPr>
         <w:t>；</w:t>
@@ -1349,23 +1338,23 @@
       <w:pPr>
         <w:spacing w:line="360" w:lineRule="auto"/>
         <w:rPr>
-          <w:rFonts w:ascii="Times New Roman" w:eastAsia="宋体" w:hAnsi="Times New Roman" w:cs="Times New Roman"/>
-          <w:sz w:val="24"/>
-        </w:rPr>
-      </w:pPr>
-    </w:p>
-    <w:p>
-      <w:pPr>
-        <w:spacing w:line="360" w:lineRule="auto"/>
-        <w:rPr>
-          <w:rFonts w:ascii="Times New Roman" w:eastAsia="宋体" w:hAnsi="Times New Roman" w:cs="Times New Roman"/>
-          <w:b/>
-          <w:sz w:val="24"/>
-        </w:rPr>
-      </w:pPr>
-      <w:r>
-        <w:rPr>
-          <w:rFonts w:ascii="Times New Roman" w:eastAsia="宋体" w:hAnsi="Times New Roman" w:cs="Times New Roman" w:hint="eastAsia"/>
+          <w:rFonts w:ascii="Times New Roman" w:eastAsia="SimSun" w:hAnsi="Times New Roman" w:cs="Times New Roman"/>
+          <w:sz w:val="24"/>
+        </w:rPr>
+      </w:pPr>
+    </w:p>
+    <w:p>
+      <w:pPr>
+        <w:spacing w:line="360" w:lineRule="auto"/>
+        <w:rPr>
+          <w:rFonts w:ascii="Times New Roman" w:eastAsia="SimSun" w:hAnsi="Times New Roman" w:cs="Times New Roman"/>
+          <w:b/>
+          <w:sz w:val="24"/>
+        </w:rPr>
+      </w:pPr>
+      <w:r>
+        <w:rPr>
+          <w:rFonts w:ascii="Times New Roman" w:eastAsia="SimSun" w:hAnsi="Times New Roman" w:cs="Times New Roman" w:hint="eastAsia"/>
           <w:b/>
           <w:sz w:val="28"/>
         </w:rPr>
@@ -1373,7 +1362,7 @@
       </w:r>
       <w:r>
         <w:rPr>
-          <w:rFonts w:ascii="Times New Roman" w:eastAsia="宋体" w:hAnsi="Times New Roman" w:cs="Times New Roman" w:hint="eastAsia"/>
+          <w:rFonts w:ascii="Times New Roman" w:eastAsia="SimSun" w:hAnsi="Times New Roman" w:cs="Times New Roman" w:hint="eastAsia"/>
           <w:b/>
           <w:sz w:val="28"/>
         </w:rPr>
@@ -1381,7 +1370,7 @@
       </w:r>
       <w:r>
         <w:rPr>
-          <w:rFonts w:ascii="Times New Roman" w:eastAsia="宋体" w:hAnsi="Times New Roman" w:cs="Times New Roman" w:hint="eastAsia"/>
+          <w:rFonts w:ascii="Times New Roman" w:eastAsia="SimSun" w:hAnsi="Times New Roman" w:cs="Times New Roman" w:hint="eastAsia"/>
           <w:b/>
           <w:sz w:val="28"/>
         </w:rPr>
@@ -1389,7 +1378,7 @@
       </w:r>
       <w:r>
         <w:rPr>
-          <w:rFonts w:ascii="Times New Roman" w:eastAsia="宋体" w:hAnsi="Times New Roman" w:cs="Times New Roman" w:hint="eastAsia"/>
+          <w:rFonts w:ascii="Times New Roman" w:eastAsia="SimSun" w:hAnsi="Times New Roman" w:cs="Times New Roman" w:hint="eastAsia"/>
           <w:b/>
           <w:sz w:val="28"/>
         </w:rPr>
@@ -1397,7 +1386,7 @@
       </w:r>
       <w:r>
         <w:rPr>
-          <w:rFonts w:ascii="Times New Roman" w:eastAsia="宋体" w:hAnsi="Times New Roman" w:cs="Times New Roman"/>
+          <w:rFonts w:ascii="Times New Roman" w:eastAsia="SimSun" w:hAnsi="Times New Roman" w:cs="Times New Roman"/>
           <w:b/>
           <w:sz w:val="28"/>
         </w:rPr>
@@ -1405,7 +1394,7 @@
       </w:r>
       <w:r>
         <w:rPr>
-          <w:rFonts w:ascii="Times New Roman" w:eastAsia="宋体" w:hAnsi="Times New Roman" w:cs="Times New Roman" w:hint="eastAsia"/>
+          <w:rFonts w:ascii="Times New Roman" w:eastAsia="SimSun" w:hAnsi="Times New Roman" w:cs="Times New Roman" w:hint="eastAsia"/>
           <w:b/>
           <w:sz w:val="24"/>
         </w:rPr>
@@ -1417,21 +1406,21 @@
         <w:spacing w:line="360" w:lineRule="auto"/>
         <w:ind w:firstLineChars="200" w:firstLine="480"/>
         <w:rPr>
-          <w:rFonts w:ascii="Times New Roman" w:eastAsia="宋体" w:hAnsi="Times New Roman" w:cs="Times New Roman"/>
-          <w:color w:val="FF0000"/>
-          <w:sz w:val="24"/>
-        </w:rPr>
-      </w:pPr>
-      <w:r>
-        <w:rPr>
-          <w:rFonts w:ascii="Times New Roman" w:eastAsia="宋体" w:hAnsi="Times New Roman" w:cs="Times New Roman" w:hint="eastAsia"/>
+          <w:rFonts w:ascii="Times New Roman" w:eastAsia="SimSun" w:hAnsi="Times New Roman" w:cs="Times New Roman"/>
+          <w:color w:val="FF0000"/>
+          <w:sz w:val="24"/>
+        </w:rPr>
+      </w:pPr>
+      <w:r>
+        <w:rPr>
+          <w:rFonts w:ascii="Times New Roman" w:eastAsia="SimSun" w:hAnsi="Times New Roman" w:cs="Times New Roman" w:hint="eastAsia"/>
           <w:sz w:val="24"/>
         </w:rPr>
         <w:t>阐述最终实现的成果</w:t>
       </w:r>
       <w:r>
         <w:rPr>
-          <w:rFonts w:ascii="Times New Roman" w:eastAsia="宋体" w:hAnsi="Times New Roman" w:cs="Times New Roman" w:hint="eastAsia"/>
+          <w:rFonts w:ascii="Times New Roman" w:eastAsia="SimSun" w:hAnsi="Times New Roman" w:cs="Times New Roman" w:hint="eastAsia"/>
           <w:color w:val="FF0000"/>
           <w:sz w:val="24"/>
         </w:rPr>
@@ -1439,7 +1428,7 @@
       </w:r>
       <w:r>
         <w:rPr>
-          <w:rFonts w:ascii="Times New Roman" w:eastAsia="宋体" w:hAnsi="Times New Roman" w:cs="Times New Roman" w:hint="eastAsia"/>
+          <w:rFonts w:ascii="Times New Roman" w:eastAsia="SimSun" w:hAnsi="Times New Roman" w:cs="Times New Roman" w:hint="eastAsia"/>
           <w:color w:val="FF0000"/>
           <w:sz w:val="24"/>
         </w:rPr>
@@ -1447,7 +1436,7 @@
       </w:r>
       <w:r>
         <w:rPr>
-          <w:rFonts w:ascii="Times New Roman" w:eastAsia="宋体" w:hAnsi="Times New Roman" w:cs="Times New Roman" w:hint="eastAsia"/>
+          <w:rFonts w:ascii="Times New Roman" w:eastAsia="SimSun" w:hAnsi="Times New Roman" w:cs="Times New Roman" w:hint="eastAsia"/>
           <w:color w:val="FF0000"/>
           <w:sz w:val="24"/>
         </w:rPr>
@@ -1455,7 +1444,7 @@
       </w:r>
       <w:r>
         <w:rPr>
-          <w:rFonts w:ascii="Times New Roman" w:eastAsia="宋体" w:hAnsi="Times New Roman" w:cs="Times New Roman" w:hint="eastAsia"/>
+          <w:rFonts w:ascii="Times New Roman" w:eastAsia="SimSun" w:hAnsi="Times New Roman" w:cs="Times New Roman" w:hint="eastAsia"/>
           <w:color w:val="FF0000"/>
           <w:sz w:val="24"/>
         </w:rPr>
@@ -1472,27 +1461,27 @@
         <w:spacing w:line="360" w:lineRule="auto"/>
         <w:ind w:firstLineChars="0"/>
         <w:rPr>
-          <w:rFonts w:ascii="Times New Roman" w:eastAsia="宋体" w:hAnsi="Times New Roman" w:cs="Times New Roman"/>
-          <w:sz w:val="24"/>
-        </w:rPr>
-      </w:pPr>
-      <w:r>
-        <w:rPr>
-          <w:rFonts w:ascii="Times New Roman" w:eastAsia="宋体" w:hAnsi="Times New Roman" w:cs="Times New Roman" w:hint="eastAsia"/>
+          <w:rFonts w:ascii="Times New Roman" w:eastAsia="SimSun" w:hAnsi="Times New Roman" w:cs="Times New Roman"/>
+          <w:sz w:val="24"/>
+        </w:rPr>
+      </w:pPr>
+      <w:r>
+        <w:rPr>
+          <w:rFonts w:ascii="Times New Roman" w:eastAsia="SimSun" w:hAnsi="Times New Roman" w:cs="Times New Roman" w:hint="eastAsia"/>
           <w:sz w:val="24"/>
         </w:rPr>
         <w:t xml:space="preserve"> </w:t>
       </w:r>
       <w:r>
         <w:rPr>
-          <w:rFonts w:ascii="Times New Roman" w:eastAsia="宋体" w:hAnsi="Times New Roman" w:cs="Times New Roman" w:hint="eastAsia"/>
+          <w:rFonts w:ascii="Times New Roman" w:eastAsia="SimSun" w:hAnsi="Times New Roman" w:cs="Times New Roman" w:hint="eastAsia"/>
           <w:sz w:val="24"/>
         </w:rPr>
         <w:t>整体介绍</w:t>
       </w:r>
       <w:r>
         <w:rPr>
-          <w:rFonts w:ascii="Times New Roman" w:eastAsia="宋体" w:hAnsi="Times New Roman" w:cs="Times New Roman" w:hint="eastAsia"/>
+          <w:rFonts w:ascii="Times New Roman" w:eastAsia="SimSun" w:hAnsi="Times New Roman" w:cs="Times New Roman" w:hint="eastAsia"/>
           <w:color w:val="FF0000"/>
           <w:sz w:val="24"/>
         </w:rPr>
@@ -1500,7 +1489,7 @@
       </w:r>
       <w:r>
         <w:rPr>
-          <w:rFonts w:ascii="Times New Roman" w:eastAsia="宋体" w:hAnsi="Times New Roman" w:cs="Times New Roman" w:hint="eastAsia"/>
+          <w:rFonts w:ascii="Times New Roman" w:eastAsia="SimSun" w:hAnsi="Times New Roman" w:cs="Times New Roman" w:hint="eastAsia"/>
           <w:color w:val="FF0000"/>
           <w:sz w:val="24"/>
         </w:rPr>
@@ -1508,7 +1497,7 @@
       </w:r>
       <w:r>
         <w:rPr>
-          <w:rFonts w:ascii="Times New Roman" w:eastAsia="宋体" w:hAnsi="Times New Roman" w:cs="Times New Roman" w:hint="eastAsia"/>
+          <w:rFonts w:ascii="Times New Roman" w:eastAsia="SimSun" w:hAnsi="Times New Roman" w:cs="Times New Roman" w:hint="eastAsia"/>
           <w:color w:val="FF0000"/>
           <w:sz w:val="24"/>
         </w:rPr>
@@ -1516,7 +1505,7 @@
       </w:r>
       <w:r>
         <w:rPr>
-          <w:rFonts w:ascii="Times New Roman" w:eastAsia="宋体" w:hAnsi="Times New Roman" w:cs="Times New Roman" w:hint="eastAsia"/>
+          <w:rFonts w:ascii="Times New Roman" w:eastAsia="SimSun" w:hAnsi="Times New Roman" w:cs="Times New Roman" w:hint="eastAsia"/>
           <w:color w:val="FF0000"/>
           <w:sz w:val="24"/>
         </w:rPr>
@@ -1524,7 +1513,7 @@
       </w:r>
       <w:r>
         <w:rPr>
-          <w:rFonts w:ascii="Times New Roman" w:eastAsia="宋体" w:hAnsi="Times New Roman" w:cs="Times New Roman" w:hint="eastAsia"/>
+          <w:rFonts w:ascii="Times New Roman" w:eastAsia="SimSun" w:hAnsi="Times New Roman" w:cs="Times New Roman" w:hint="eastAsia"/>
           <w:color w:val="FF0000"/>
           <w:sz w:val="24"/>
         </w:rPr>
@@ -1532,7 +1521,7 @@
       </w:r>
       <w:r>
         <w:rPr>
-          <w:rFonts w:ascii="Times New Roman" w:eastAsia="宋体" w:hAnsi="Times New Roman" w:cs="Times New Roman" w:hint="eastAsia"/>
+          <w:rFonts w:ascii="Times New Roman" w:eastAsia="SimSun" w:hAnsi="Times New Roman" w:cs="Times New Roman" w:hint="eastAsia"/>
           <w:color w:val="FF0000"/>
           <w:sz w:val="24"/>
         </w:rPr>
@@ -1543,7 +1532,7 @@
       <w:pPr>
         <w:spacing w:line="360" w:lineRule="auto"/>
         <w:rPr>
-          <w:rFonts w:ascii="Times New Roman" w:eastAsia="宋体" w:hAnsi="Times New Roman" w:cs="Times New Roman"/>
+          <w:rFonts w:ascii="Times New Roman" w:eastAsia="SimSun" w:hAnsi="Times New Roman" w:cs="Times New Roman"/>
           <w:sz w:val="24"/>
         </w:rPr>
       </w:pPr>
@@ -1558,41 +1547,41 @@
         <w:spacing w:line="360" w:lineRule="auto"/>
         <w:ind w:firstLineChars="0"/>
         <w:rPr>
-          <w:rFonts w:ascii="Times New Roman" w:eastAsia="宋体" w:hAnsi="Times New Roman" w:cs="Times New Roman"/>
-          <w:sz w:val="24"/>
-        </w:rPr>
-      </w:pPr>
-      <w:r>
-        <w:rPr>
-          <w:rFonts w:ascii="Times New Roman" w:eastAsia="宋体" w:hAnsi="Times New Roman" w:cs="Times New Roman" w:hint="eastAsia"/>
+          <w:rFonts w:ascii="Times New Roman" w:eastAsia="SimSun" w:hAnsi="Times New Roman" w:cs="Times New Roman"/>
+          <w:sz w:val="24"/>
+        </w:rPr>
+      </w:pPr>
+      <w:r>
+        <w:rPr>
+          <w:rFonts w:ascii="Times New Roman" w:eastAsia="SimSun" w:hAnsi="Times New Roman" w:cs="Times New Roman" w:hint="eastAsia"/>
           <w:sz w:val="24"/>
         </w:rPr>
         <w:t xml:space="preserve"> </w:t>
       </w:r>
       <w:r>
         <w:rPr>
-          <w:rFonts w:ascii="Times New Roman" w:eastAsia="宋体" w:hAnsi="Times New Roman" w:cs="Times New Roman" w:hint="eastAsia"/>
+          <w:rFonts w:ascii="Times New Roman" w:eastAsia="SimSun" w:hAnsi="Times New Roman" w:cs="Times New Roman" w:hint="eastAsia"/>
           <w:sz w:val="24"/>
         </w:rPr>
         <w:t>工程成果</w:t>
       </w:r>
       <w:r>
         <w:rPr>
-          <w:rFonts w:ascii="Times New Roman" w:eastAsia="宋体" w:hAnsi="Times New Roman" w:cs="Times New Roman" w:hint="eastAsia"/>
+          <w:rFonts w:ascii="Times New Roman" w:eastAsia="SimSun" w:hAnsi="Times New Roman" w:cs="Times New Roman" w:hint="eastAsia"/>
           <w:sz w:val="24"/>
         </w:rPr>
         <w:t>（</w:t>
       </w:r>
       <w:r>
         <w:rPr>
-          <w:rFonts w:ascii="Times New Roman" w:eastAsia="宋体" w:hAnsi="Times New Roman" w:cs="Times New Roman" w:hint="eastAsia"/>
+          <w:rFonts w:ascii="Times New Roman" w:eastAsia="SimSun" w:hAnsi="Times New Roman" w:cs="Times New Roman" w:hint="eastAsia"/>
           <w:sz w:val="24"/>
         </w:rPr>
         <w:t>分</w:t>
       </w:r>
       <w:r>
         <w:rPr>
-          <w:rFonts w:ascii="Times New Roman" w:eastAsia="宋体" w:hAnsi="Times New Roman" w:cs="Times New Roman" w:hint="eastAsia"/>
+          <w:rFonts w:ascii="Times New Roman" w:eastAsia="SimSun" w:hAnsi="Times New Roman" w:cs="Times New Roman" w:hint="eastAsia"/>
           <w:sz w:val="24"/>
         </w:rPr>
         <w:t>硬件实物、软件界面等设计结果）</w:t>
@@ -1604,34 +1593,34 @@
         <w:spacing w:line="360" w:lineRule="auto"/>
         <w:ind w:left="360" w:firstLineChars="0" w:firstLine="0"/>
         <w:rPr>
-          <w:rFonts w:ascii="Times New Roman" w:eastAsia="宋体" w:hAnsi="Times New Roman" w:cs="Times New Roman"/>
-          <w:sz w:val="24"/>
-        </w:rPr>
-      </w:pPr>
-      <w:r>
-        <w:rPr>
-          <w:rFonts w:ascii="Times New Roman" w:eastAsia="宋体" w:hAnsi="Times New Roman" w:cs="Times New Roman" w:hint="eastAsia"/>
+          <w:rFonts w:ascii="Times New Roman" w:eastAsia="SimSun" w:hAnsi="Times New Roman" w:cs="Times New Roman"/>
+          <w:sz w:val="24"/>
+        </w:rPr>
+      </w:pPr>
+      <w:r>
+        <w:rPr>
+          <w:rFonts w:ascii="Times New Roman" w:eastAsia="SimSun" w:hAnsi="Times New Roman" w:cs="Times New Roman" w:hint="eastAsia"/>
           <w:sz w:val="24"/>
         </w:rPr>
         <w:t>3.2.1</w:t>
       </w:r>
       <w:r>
         <w:rPr>
-          <w:rFonts w:ascii="Times New Roman" w:eastAsia="宋体" w:hAnsi="Times New Roman" w:cs="Times New Roman"/>
+          <w:rFonts w:ascii="Times New Roman" w:eastAsia="SimSun" w:hAnsi="Times New Roman" w:cs="Times New Roman"/>
           <w:sz w:val="24"/>
         </w:rPr>
         <w:t xml:space="preserve"> </w:t>
       </w:r>
       <w:r>
         <w:rPr>
-          <w:rFonts w:ascii="Times New Roman" w:eastAsia="宋体" w:hAnsi="Times New Roman" w:cs="Times New Roman" w:hint="eastAsia"/>
+          <w:rFonts w:ascii="Times New Roman" w:eastAsia="SimSun" w:hAnsi="Times New Roman" w:cs="Times New Roman" w:hint="eastAsia"/>
           <w:sz w:val="24"/>
         </w:rPr>
         <w:t>机械成果；</w:t>
       </w:r>
       <w:r>
         <w:rPr>
-          <w:rFonts w:ascii="Times New Roman" w:eastAsia="宋体" w:hAnsi="Times New Roman" w:cs="Times New Roman" w:hint="eastAsia"/>
+          <w:rFonts w:ascii="Times New Roman" w:eastAsia="SimSun" w:hAnsi="Times New Roman" w:cs="Times New Roman" w:hint="eastAsia"/>
           <w:color w:val="FF0000"/>
           <w:sz w:val="24"/>
         </w:rPr>
@@ -1639,7 +1628,7 @@
       </w:r>
       <w:r>
         <w:rPr>
-          <w:rFonts w:ascii="Times New Roman" w:eastAsia="宋体" w:hAnsi="Times New Roman" w:cs="Times New Roman" w:hint="eastAsia"/>
+          <w:rFonts w:ascii="Times New Roman" w:eastAsia="SimSun" w:hAnsi="Times New Roman" w:cs="Times New Roman" w:hint="eastAsia"/>
           <w:color w:val="FF0000"/>
           <w:sz w:val="24"/>
         </w:rPr>
@@ -1647,7 +1636,7 @@
       </w:r>
       <w:r>
         <w:rPr>
-          <w:rFonts w:ascii="Times New Roman" w:eastAsia="宋体" w:hAnsi="Times New Roman" w:cs="Times New Roman" w:hint="eastAsia"/>
+          <w:rFonts w:ascii="Times New Roman" w:eastAsia="SimSun" w:hAnsi="Times New Roman" w:cs="Times New Roman" w:hint="eastAsia"/>
           <w:color w:val="FF0000"/>
           <w:sz w:val="24"/>
         </w:rPr>
@@ -1660,34 +1649,34 @@
         <w:spacing w:line="360" w:lineRule="auto"/>
         <w:ind w:left="360" w:firstLineChars="0" w:firstLine="0"/>
         <w:rPr>
-          <w:rFonts w:ascii="Times New Roman" w:eastAsia="宋体" w:hAnsi="Times New Roman" w:cs="Times New Roman"/>
-          <w:sz w:val="24"/>
-        </w:rPr>
-      </w:pPr>
-      <w:r>
-        <w:rPr>
-          <w:rFonts w:ascii="Times New Roman" w:eastAsia="宋体" w:hAnsi="Times New Roman" w:cs="Times New Roman" w:hint="eastAsia"/>
+          <w:rFonts w:ascii="Times New Roman" w:eastAsia="SimSun" w:hAnsi="Times New Roman" w:cs="Times New Roman"/>
+          <w:sz w:val="24"/>
+        </w:rPr>
+      </w:pPr>
+      <w:r>
+        <w:rPr>
+          <w:rFonts w:ascii="Times New Roman" w:eastAsia="SimSun" w:hAnsi="Times New Roman" w:cs="Times New Roman" w:hint="eastAsia"/>
           <w:sz w:val="24"/>
         </w:rPr>
         <w:t>3.2.2</w:t>
       </w:r>
       <w:r>
         <w:rPr>
-          <w:rFonts w:ascii="Times New Roman" w:eastAsia="宋体" w:hAnsi="Times New Roman" w:cs="Times New Roman"/>
+          <w:rFonts w:ascii="Times New Roman" w:eastAsia="SimSun" w:hAnsi="Times New Roman" w:cs="Times New Roman"/>
           <w:sz w:val="24"/>
         </w:rPr>
         <w:t xml:space="preserve"> </w:t>
       </w:r>
       <w:r>
         <w:rPr>
-          <w:rFonts w:ascii="Times New Roman" w:eastAsia="宋体" w:hAnsi="Times New Roman" w:cs="Times New Roman" w:hint="eastAsia"/>
+          <w:rFonts w:ascii="Times New Roman" w:eastAsia="SimSun" w:hAnsi="Times New Roman" w:cs="Times New Roman" w:hint="eastAsia"/>
           <w:sz w:val="24"/>
         </w:rPr>
         <w:t>电路成果；</w:t>
       </w:r>
       <w:r>
         <w:rPr>
-          <w:rFonts w:ascii="Times New Roman" w:eastAsia="宋体" w:hAnsi="Times New Roman" w:cs="Times New Roman" w:hint="eastAsia"/>
+          <w:rFonts w:ascii="Times New Roman" w:eastAsia="SimSun" w:hAnsi="Times New Roman" w:cs="Times New Roman" w:hint="eastAsia"/>
           <w:color w:val="FF0000"/>
           <w:sz w:val="24"/>
         </w:rPr>
@@ -1695,7 +1684,7 @@
       </w:r>
       <w:r>
         <w:rPr>
-          <w:rFonts w:ascii="Times New Roman" w:eastAsia="宋体" w:hAnsi="Times New Roman" w:cs="Times New Roman" w:hint="eastAsia"/>
+          <w:rFonts w:ascii="Times New Roman" w:eastAsia="SimSun" w:hAnsi="Times New Roman" w:cs="Times New Roman" w:hint="eastAsia"/>
           <w:color w:val="FF0000"/>
           <w:sz w:val="24"/>
         </w:rPr>
@@ -1703,7 +1692,7 @@
       </w:r>
       <w:r>
         <w:rPr>
-          <w:rFonts w:ascii="Times New Roman" w:eastAsia="宋体" w:hAnsi="Times New Roman" w:cs="Times New Roman" w:hint="eastAsia"/>
+          <w:rFonts w:ascii="Times New Roman" w:eastAsia="SimSun" w:hAnsi="Times New Roman" w:cs="Times New Roman" w:hint="eastAsia"/>
           <w:color w:val="FF0000"/>
           <w:sz w:val="24"/>
         </w:rPr>
@@ -1716,49 +1705,49 @@
         <w:spacing w:line="360" w:lineRule="auto"/>
         <w:ind w:left="360" w:firstLineChars="0" w:firstLine="0"/>
         <w:rPr>
-          <w:rFonts w:ascii="Times New Roman" w:eastAsia="宋体" w:hAnsi="Times New Roman" w:cs="Times New Roman"/>
-          <w:color w:val="FF0000"/>
-          <w:sz w:val="24"/>
-        </w:rPr>
-      </w:pPr>
-      <w:r>
-        <w:rPr>
-          <w:rFonts w:ascii="Times New Roman" w:eastAsia="宋体" w:hAnsi="Times New Roman" w:cs="Times New Roman" w:hint="eastAsia"/>
+          <w:rFonts w:ascii="Times New Roman" w:eastAsia="SimSun" w:hAnsi="Times New Roman" w:cs="Times New Roman"/>
+          <w:color w:val="FF0000"/>
+          <w:sz w:val="24"/>
+        </w:rPr>
+      </w:pPr>
+      <w:r>
+        <w:rPr>
+          <w:rFonts w:ascii="Times New Roman" w:eastAsia="SimSun" w:hAnsi="Times New Roman" w:cs="Times New Roman" w:hint="eastAsia"/>
           <w:sz w:val="24"/>
         </w:rPr>
         <w:t>3</w:t>
       </w:r>
       <w:r>
         <w:rPr>
-          <w:rFonts w:ascii="Times New Roman" w:eastAsia="宋体" w:hAnsi="Times New Roman" w:cs="Times New Roman" w:hint="eastAsia"/>
+          <w:rFonts w:ascii="Times New Roman" w:eastAsia="SimSun" w:hAnsi="Times New Roman" w:cs="Times New Roman" w:hint="eastAsia"/>
           <w:sz w:val="24"/>
         </w:rPr>
         <w:t>.2.</w:t>
       </w:r>
       <w:r>
         <w:rPr>
-          <w:rFonts w:ascii="Times New Roman" w:eastAsia="宋体" w:hAnsi="Times New Roman" w:cs="Times New Roman" w:hint="eastAsia"/>
+          <w:rFonts w:ascii="Times New Roman" w:eastAsia="SimSun" w:hAnsi="Times New Roman" w:cs="Times New Roman" w:hint="eastAsia"/>
           <w:sz w:val="24"/>
         </w:rPr>
         <w:t>3</w:t>
       </w:r>
       <w:r>
         <w:rPr>
-          <w:rFonts w:ascii="Times New Roman" w:eastAsia="宋体" w:hAnsi="Times New Roman" w:cs="Times New Roman"/>
+          <w:rFonts w:ascii="Times New Roman" w:eastAsia="SimSun" w:hAnsi="Times New Roman" w:cs="Times New Roman"/>
           <w:sz w:val="24"/>
         </w:rPr>
         <w:t xml:space="preserve"> </w:t>
       </w:r>
       <w:r>
         <w:rPr>
-          <w:rFonts w:ascii="Times New Roman" w:eastAsia="宋体" w:hAnsi="Times New Roman" w:cs="Times New Roman" w:hint="eastAsia"/>
+          <w:rFonts w:ascii="Times New Roman" w:eastAsia="SimSun" w:hAnsi="Times New Roman" w:cs="Times New Roman" w:hint="eastAsia"/>
           <w:sz w:val="24"/>
         </w:rPr>
         <w:t>软件成果；</w:t>
       </w:r>
       <w:r>
         <w:rPr>
-          <w:rFonts w:ascii="Times New Roman" w:eastAsia="宋体" w:hAnsi="Times New Roman" w:cs="Times New Roman" w:hint="eastAsia"/>
+          <w:rFonts w:ascii="Times New Roman" w:eastAsia="SimSun" w:hAnsi="Times New Roman" w:cs="Times New Roman" w:hint="eastAsia"/>
           <w:color w:val="FF0000"/>
           <w:sz w:val="24"/>
         </w:rPr>
@@ -1766,7 +1755,7 @@
       </w:r>
       <w:r>
         <w:rPr>
-          <w:rFonts w:ascii="Times New Roman" w:eastAsia="宋体" w:hAnsi="Times New Roman" w:cs="Times New Roman" w:hint="eastAsia"/>
+          <w:rFonts w:ascii="Times New Roman" w:eastAsia="SimSun" w:hAnsi="Times New Roman" w:cs="Times New Roman" w:hint="eastAsia"/>
           <w:color w:val="FF0000"/>
           <w:sz w:val="24"/>
         </w:rPr>
@@ -1774,7 +1763,7 @@
       </w:r>
       <w:r>
         <w:rPr>
-          <w:rFonts w:ascii="Times New Roman" w:eastAsia="宋体" w:hAnsi="Times New Roman" w:cs="Times New Roman" w:hint="eastAsia"/>
+          <w:rFonts w:ascii="Times New Roman" w:eastAsia="SimSun" w:hAnsi="Times New Roman" w:cs="Times New Roman" w:hint="eastAsia"/>
           <w:color w:val="FF0000"/>
           <w:sz w:val="24"/>
         </w:rPr>
@@ -1785,7 +1774,7 @@
       <w:pPr>
         <w:spacing w:line="360" w:lineRule="auto"/>
         <w:rPr>
-          <w:rFonts w:ascii="Times New Roman" w:eastAsia="宋体" w:hAnsi="Times New Roman" w:cs="Times New Roman"/>
+          <w:rFonts w:ascii="Times New Roman" w:eastAsia="SimSun" w:hAnsi="Times New Roman" w:cs="Times New Roman"/>
           <w:b/>
           <w:sz w:val="24"/>
         </w:rPr>
@@ -1801,34 +1790,34 @@
         <w:spacing w:line="360" w:lineRule="auto"/>
         <w:ind w:firstLineChars="0"/>
         <w:rPr>
-          <w:rFonts w:ascii="Times New Roman" w:eastAsia="宋体" w:hAnsi="Times New Roman" w:cs="Times New Roman"/>
-          <w:sz w:val="24"/>
-        </w:rPr>
-      </w:pPr>
-      <w:r>
-        <w:rPr>
-          <w:rFonts w:ascii="Times New Roman" w:eastAsia="宋体" w:hAnsi="Times New Roman" w:cs="Times New Roman" w:hint="eastAsia"/>
+          <w:rFonts w:ascii="Times New Roman" w:eastAsia="SimSun" w:hAnsi="Times New Roman" w:cs="Times New Roman"/>
+          <w:sz w:val="24"/>
+        </w:rPr>
+      </w:pPr>
+      <w:r>
+        <w:rPr>
+          <w:rFonts w:ascii="Times New Roman" w:eastAsia="SimSun" w:hAnsi="Times New Roman" w:cs="Times New Roman" w:hint="eastAsia"/>
           <w:sz w:val="24"/>
         </w:rPr>
         <w:t xml:space="preserve"> </w:t>
       </w:r>
       <w:r>
         <w:rPr>
-          <w:rFonts w:ascii="Times New Roman" w:eastAsia="宋体" w:hAnsi="Times New Roman" w:cs="Times New Roman" w:hint="eastAsia"/>
+          <w:rFonts w:ascii="Times New Roman" w:eastAsia="SimSun" w:hAnsi="Times New Roman" w:cs="Times New Roman" w:hint="eastAsia"/>
           <w:sz w:val="24"/>
         </w:rPr>
         <w:t>特性</w:t>
       </w:r>
       <w:r>
         <w:rPr>
-          <w:rFonts w:ascii="Times New Roman" w:eastAsia="宋体" w:hAnsi="Times New Roman" w:cs="Times New Roman" w:hint="eastAsia"/>
+          <w:rFonts w:ascii="Times New Roman" w:eastAsia="SimSun" w:hAnsi="Times New Roman" w:cs="Times New Roman" w:hint="eastAsia"/>
           <w:sz w:val="24"/>
         </w:rPr>
         <w:t>成果（逐个展示功能、性能参数等量化指标）</w:t>
       </w:r>
       <w:r>
         <w:rPr>
-          <w:rFonts w:ascii="Times New Roman" w:eastAsia="宋体" w:hAnsi="Times New Roman" w:cs="Times New Roman" w:hint="eastAsia"/>
+          <w:rFonts w:ascii="Times New Roman" w:eastAsia="SimSun" w:hAnsi="Times New Roman" w:cs="Times New Roman" w:hint="eastAsia"/>
           <w:color w:val="FF0000"/>
           <w:sz w:val="24"/>
         </w:rPr>
@@ -1836,7 +1825,7 @@
       </w:r>
       <w:r>
         <w:rPr>
-          <w:rFonts w:ascii="Times New Roman" w:eastAsia="宋体" w:hAnsi="Times New Roman" w:cs="Times New Roman" w:hint="eastAsia"/>
+          <w:rFonts w:ascii="Times New Roman" w:eastAsia="SimSun" w:hAnsi="Times New Roman" w:cs="Times New Roman" w:hint="eastAsia"/>
           <w:color w:val="FF0000"/>
           <w:sz w:val="24"/>
         </w:rPr>
@@ -1844,7 +1833,7 @@
       </w:r>
       <w:r>
         <w:rPr>
-          <w:rFonts w:ascii="Times New Roman" w:eastAsia="宋体" w:hAnsi="Times New Roman" w:cs="Times New Roman" w:hint="eastAsia"/>
+          <w:rFonts w:ascii="Times New Roman" w:eastAsia="SimSun" w:hAnsi="Times New Roman" w:cs="Times New Roman" w:hint="eastAsia"/>
           <w:color w:val="FF0000"/>
           <w:sz w:val="24"/>
         </w:rPr>
@@ -1852,7 +1841,7 @@
       </w:r>
       <w:r>
         <w:rPr>
-          <w:rFonts w:ascii="Times New Roman" w:eastAsia="宋体" w:hAnsi="Times New Roman" w:cs="Times New Roman" w:hint="eastAsia"/>
+          <w:rFonts w:ascii="Times New Roman" w:eastAsia="SimSun" w:hAnsi="Times New Roman" w:cs="Times New Roman" w:hint="eastAsia"/>
           <w:color w:val="FF0000"/>
           <w:sz w:val="24"/>
         </w:rPr>
@@ -1863,7 +1852,7 @@
       <w:pPr>
         <w:spacing w:line="360" w:lineRule="auto"/>
         <w:rPr>
-          <w:rFonts w:ascii="Times New Roman" w:eastAsia="宋体" w:hAnsi="Times New Roman" w:cs="Times New Roman"/>
+          <w:rFonts w:ascii="Times New Roman" w:eastAsia="SimSun" w:hAnsi="Times New Roman" w:cs="Times New Roman"/>
           <w:b/>
           <w:sz w:val="28"/>
         </w:rPr>
@@ -1873,23 +1862,22 @@
       <w:pPr>
         <w:spacing w:line="360" w:lineRule="auto"/>
         <w:rPr>
-          <w:rFonts w:ascii="Times New Roman" w:eastAsia="宋体" w:hAnsi="Times New Roman" w:cs="Times New Roman"/>
-          <w:b/>
-          <w:sz w:val="24"/>
-        </w:rPr>
-      </w:pPr>
-      <w:r>
-        <w:rPr>
-          <w:rFonts w:ascii="Times New Roman" w:eastAsia="宋体" w:hAnsi="Times New Roman" w:cs="Times New Roman" w:hint="eastAsia"/>
+          <w:rFonts w:ascii="Times New Roman" w:eastAsia="SimSun" w:hAnsi="Times New Roman" w:cs="Times New Roman"/>
+          <w:b/>
+          <w:sz w:val="24"/>
+        </w:rPr>
+      </w:pPr>
+      <w:r>
+        <w:rPr>
+          <w:rFonts w:ascii="Times New Roman" w:eastAsia="SimSun" w:hAnsi="Times New Roman" w:cs="Times New Roman" w:hint="eastAsia"/>
           <w:b/>
           <w:sz w:val="28"/>
         </w:rPr>
-        <w:lastRenderedPageBreak/>
         <w:t>第</w:t>
       </w:r>
       <w:r>
         <w:rPr>
-          <w:rFonts w:ascii="Times New Roman" w:eastAsia="宋体" w:hAnsi="Times New Roman" w:cs="Times New Roman" w:hint="eastAsia"/>
+          <w:rFonts w:ascii="Times New Roman" w:eastAsia="SimSun" w:hAnsi="Times New Roman" w:cs="Times New Roman" w:hint="eastAsia"/>
           <w:b/>
           <w:sz w:val="28"/>
         </w:rPr>
@@ -1897,7 +1885,7 @@
       </w:r>
       <w:r>
         <w:rPr>
-          <w:rFonts w:ascii="Times New Roman" w:eastAsia="宋体" w:hAnsi="Times New Roman" w:cs="Times New Roman" w:hint="eastAsia"/>
+          <w:rFonts w:ascii="Times New Roman" w:eastAsia="SimSun" w:hAnsi="Times New Roman" w:cs="Times New Roman" w:hint="eastAsia"/>
           <w:b/>
           <w:sz w:val="28"/>
         </w:rPr>
@@ -1905,7 +1893,7 @@
       </w:r>
       <w:r>
         <w:rPr>
-          <w:rFonts w:ascii="Times New Roman" w:eastAsia="宋体" w:hAnsi="Times New Roman" w:cs="Times New Roman" w:hint="eastAsia"/>
+          <w:rFonts w:ascii="Times New Roman" w:eastAsia="SimSun" w:hAnsi="Times New Roman" w:cs="Times New Roman" w:hint="eastAsia"/>
           <w:b/>
           <w:sz w:val="28"/>
         </w:rPr>
@@ -1913,7 +1901,7 @@
       </w:r>
       <w:r>
         <w:rPr>
-          <w:rFonts w:ascii="Times New Roman" w:eastAsia="宋体" w:hAnsi="Times New Roman" w:cs="Times New Roman"/>
+          <w:rFonts w:ascii="Times New Roman" w:eastAsia="SimSun" w:hAnsi="Times New Roman" w:cs="Times New Roman"/>
           <w:b/>
           <w:sz w:val="28"/>
         </w:rPr>
@@ -1921,7 +1909,7 @@
       </w:r>
       <w:r>
         <w:rPr>
-          <w:rFonts w:ascii="Times New Roman" w:eastAsia="宋体" w:hAnsi="Times New Roman" w:cs="Times New Roman" w:hint="eastAsia"/>
+          <w:rFonts w:ascii="Times New Roman" w:eastAsia="SimSun" w:hAnsi="Times New Roman" w:cs="Times New Roman" w:hint="eastAsia"/>
           <w:b/>
           <w:sz w:val="24"/>
         </w:rPr>
@@ -1938,7 +1926,7 @@
         <w:spacing w:line="360" w:lineRule="auto"/>
         <w:ind w:firstLineChars="0"/>
         <w:rPr>
-          <w:rFonts w:ascii="Times New Roman" w:eastAsia="宋体" w:hAnsi="Times New Roman" w:cs="Times New Roman"/>
+          <w:rFonts w:ascii="Times New Roman" w:eastAsia="SimSun" w:hAnsi="Times New Roman" w:cs="Times New Roman"/>
           <w:vanish/>
           <w:sz w:val="24"/>
         </w:rPr>
@@ -1954,7 +1942,7 @@
         <w:spacing w:line="360" w:lineRule="auto"/>
         <w:ind w:firstLineChars="0"/>
         <w:rPr>
-          <w:rFonts w:ascii="Times New Roman" w:eastAsia="宋体" w:hAnsi="Times New Roman" w:cs="Times New Roman"/>
+          <w:rFonts w:ascii="Times New Roman" w:eastAsia="SimSun" w:hAnsi="Times New Roman" w:cs="Times New Roman"/>
           <w:vanish/>
           <w:sz w:val="24"/>
         </w:rPr>
@@ -1970,20 +1958,20 @@
         <w:spacing w:line="360" w:lineRule="auto"/>
         <w:ind w:firstLineChars="0"/>
         <w:rPr>
-          <w:rFonts w:ascii="Times New Roman" w:eastAsia="宋体" w:hAnsi="Times New Roman" w:cs="Times New Roman"/>
-          <w:sz w:val="24"/>
-        </w:rPr>
-      </w:pPr>
-      <w:r>
-        <w:rPr>
-          <w:rFonts w:ascii="Times New Roman" w:eastAsia="宋体" w:hAnsi="Times New Roman" w:cs="Times New Roman" w:hint="eastAsia"/>
+          <w:rFonts w:ascii="Times New Roman" w:eastAsia="SimSun" w:hAnsi="Times New Roman" w:cs="Times New Roman"/>
+          <w:sz w:val="24"/>
+        </w:rPr>
+      </w:pPr>
+      <w:r>
+        <w:rPr>
+          <w:rFonts w:ascii="Times New Roman" w:eastAsia="SimSun" w:hAnsi="Times New Roman" w:cs="Times New Roman" w:hint="eastAsia"/>
           <w:sz w:val="24"/>
         </w:rPr>
         <w:t xml:space="preserve"> </w:t>
       </w:r>
       <w:r>
         <w:rPr>
-          <w:rFonts w:ascii="Times New Roman" w:eastAsia="宋体" w:hAnsi="Times New Roman" w:cs="Times New Roman" w:hint="eastAsia"/>
+          <w:rFonts w:ascii="Times New Roman" w:eastAsia="SimSun" w:hAnsi="Times New Roman" w:cs="Times New Roman" w:hint="eastAsia"/>
           <w:sz w:val="24"/>
         </w:rPr>
         <w:t>可扩展之处</w:t>
@@ -1995,34 +1983,34 @@
         <w:spacing w:line="360" w:lineRule="auto"/>
         <w:ind w:left="420" w:firstLineChars="0" w:firstLine="0"/>
         <w:rPr>
-          <w:rFonts w:ascii="Times New Roman" w:eastAsia="宋体" w:hAnsi="Times New Roman" w:cs="Times New Roman"/>
-          <w:sz w:val="24"/>
-        </w:rPr>
-      </w:pPr>
-      <w:r>
-        <w:rPr>
-          <w:rFonts w:ascii="Times New Roman" w:eastAsia="宋体" w:hAnsi="Times New Roman" w:cs="Times New Roman" w:hint="eastAsia"/>
+          <w:rFonts w:ascii="Times New Roman" w:eastAsia="SimSun" w:hAnsi="Times New Roman" w:cs="Times New Roman"/>
+          <w:sz w:val="24"/>
+        </w:rPr>
+      </w:pPr>
+      <w:r>
+        <w:rPr>
+          <w:rFonts w:ascii="Times New Roman" w:eastAsia="SimSun" w:hAnsi="Times New Roman" w:cs="Times New Roman" w:hint="eastAsia"/>
           <w:sz w:val="24"/>
         </w:rPr>
         <w:t>3</w:t>
       </w:r>
       <w:r>
         <w:rPr>
-          <w:rFonts w:ascii="Times New Roman" w:eastAsia="宋体" w:hAnsi="Times New Roman" w:cs="Times New Roman"/>
+          <w:rFonts w:ascii="Times New Roman" w:eastAsia="SimSun" w:hAnsi="Times New Roman" w:cs="Times New Roman"/>
           <w:sz w:val="24"/>
         </w:rPr>
         <w:t>00</w:t>
       </w:r>
       <w:r>
         <w:rPr>
-          <w:rFonts w:ascii="Times New Roman" w:eastAsia="宋体" w:hAnsi="Times New Roman" w:cs="Times New Roman" w:hint="eastAsia"/>
+          <w:rFonts w:ascii="Times New Roman" w:eastAsia="SimSun" w:hAnsi="Times New Roman" w:cs="Times New Roman" w:hint="eastAsia"/>
           <w:sz w:val="24"/>
         </w:rPr>
         <w:t>字内</w:t>
       </w:r>
       <w:r>
         <w:rPr>
-          <w:rFonts w:ascii="Times New Roman" w:eastAsia="宋体" w:hAnsi="Times New Roman" w:cs="Times New Roman" w:hint="eastAsia"/>
+          <w:rFonts w:ascii="Times New Roman" w:eastAsia="SimSun" w:hAnsi="Times New Roman" w:cs="Times New Roman" w:hint="eastAsia"/>
           <w:sz w:val="24"/>
         </w:rPr>
         <w:t>；</w:t>
@@ -2038,20 +2026,20 @@
         <w:spacing w:line="360" w:lineRule="auto"/>
         <w:ind w:firstLineChars="0"/>
         <w:rPr>
-          <w:rFonts w:ascii="Times New Roman" w:eastAsia="宋体" w:hAnsi="Times New Roman" w:cs="Times New Roman"/>
-          <w:sz w:val="24"/>
-        </w:rPr>
-      </w:pPr>
-      <w:r>
-        <w:rPr>
-          <w:rFonts w:ascii="Times New Roman" w:eastAsia="宋体" w:hAnsi="Times New Roman" w:cs="Times New Roman" w:hint="eastAsia"/>
+          <w:rFonts w:ascii="Times New Roman" w:eastAsia="SimSun" w:hAnsi="Times New Roman" w:cs="Times New Roman"/>
+          <w:sz w:val="24"/>
+        </w:rPr>
+      </w:pPr>
+      <w:r>
+        <w:rPr>
+          <w:rFonts w:ascii="Times New Roman" w:eastAsia="SimSun" w:hAnsi="Times New Roman" w:cs="Times New Roman" w:hint="eastAsia"/>
           <w:sz w:val="24"/>
         </w:rPr>
         <w:t xml:space="preserve"> </w:t>
       </w:r>
       <w:r>
         <w:rPr>
-          <w:rFonts w:ascii="Times New Roman" w:eastAsia="宋体" w:hAnsi="Times New Roman" w:cs="Times New Roman" w:hint="eastAsia"/>
+          <w:rFonts w:ascii="Times New Roman" w:eastAsia="SimSun" w:hAnsi="Times New Roman" w:cs="Times New Roman" w:hint="eastAsia"/>
           <w:sz w:val="24"/>
         </w:rPr>
         <w:t>心得体会</w:t>
@@ -2062,48 +2050,48 @@
         <w:spacing w:line="360" w:lineRule="auto"/>
         <w:ind w:firstLineChars="175" w:firstLine="420"/>
         <w:rPr>
-          <w:rFonts w:ascii="Times New Roman" w:eastAsia="宋体" w:hAnsi="Times New Roman" w:cs="Times New Roman"/>
-          <w:sz w:val="24"/>
-        </w:rPr>
-      </w:pPr>
-      <w:r>
-        <w:rPr>
-          <w:rFonts w:ascii="Times New Roman" w:eastAsia="宋体" w:hAnsi="Times New Roman" w:cs="Times New Roman" w:hint="eastAsia"/>
+          <w:rFonts w:ascii="Times New Roman" w:eastAsia="SimSun" w:hAnsi="Times New Roman" w:cs="Times New Roman"/>
+          <w:sz w:val="24"/>
+        </w:rPr>
+      </w:pPr>
+      <w:r>
+        <w:rPr>
+          <w:rFonts w:ascii="Times New Roman" w:eastAsia="SimSun" w:hAnsi="Times New Roman" w:cs="Times New Roman" w:hint="eastAsia"/>
           <w:sz w:val="24"/>
         </w:rPr>
         <w:t>10</w:t>
       </w:r>
       <w:r>
         <w:rPr>
-          <w:rFonts w:ascii="Times New Roman" w:eastAsia="宋体" w:hAnsi="Times New Roman" w:cs="Times New Roman"/>
+          <w:rFonts w:ascii="Times New Roman" w:eastAsia="SimSun" w:hAnsi="Times New Roman" w:cs="Times New Roman"/>
           <w:sz w:val="24"/>
         </w:rPr>
         <w:t>00</w:t>
       </w:r>
       <w:r>
         <w:rPr>
-          <w:rFonts w:ascii="Times New Roman" w:eastAsia="宋体" w:hAnsi="Times New Roman" w:cs="Times New Roman" w:hint="eastAsia"/>
+          <w:rFonts w:ascii="Times New Roman" w:eastAsia="SimSun" w:hAnsi="Times New Roman" w:cs="Times New Roman" w:hint="eastAsia"/>
           <w:sz w:val="24"/>
         </w:rPr>
         <w:t>字内</w:t>
       </w:r>
       <w:r>
         <w:rPr>
-          <w:rFonts w:ascii="Times New Roman" w:eastAsia="宋体" w:hAnsi="Times New Roman" w:cs="Times New Roman" w:hint="eastAsia"/>
+          <w:rFonts w:ascii="Times New Roman" w:eastAsia="SimSun" w:hAnsi="Times New Roman" w:cs="Times New Roman" w:hint="eastAsia"/>
           <w:sz w:val="24"/>
         </w:rPr>
         <w:t>，可包括研发和</w:t>
       </w:r>
       <w:r>
         <w:rPr>
-          <w:rFonts w:ascii="Times New Roman" w:eastAsia="宋体" w:hAnsi="Times New Roman" w:cs="Times New Roman" w:hint="eastAsia"/>
+          <w:rFonts w:ascii="Times New Roman" w:eastAsia="SimSun" w:hAnsi="Times New Roman" w:cs="Times New Roman" w:hint="eastAsia"/>
           <w:sz w:val="24"/>
         </w:rPr>
         <w:t>制作细节</w:t>
       </w:r>
       <w:r>
         <w:rPr>
-          <w:rFonts w:ascii="Times New Roman" w:eastAsia="宋体" w:hAnsi="Times New Roman" w:cs="Times New Roman" w:hint="eastAsia"/>
+          <w:rFonts w:ascii="Times New Roman" w:eastAsia="SimSun" w:hAnsi="Times New Roman" w:cs="Times New Roman" w:hint="eastAsia"/>
           <w:sz w:val="24"/>
         </w:rPr>
         <w:t>；</w:t>
@@ -2113,23 +2101,23 @@
       <w:pPr>
         <w:spacing w:line="360" w:lineRule="auto"/>
         <w:rPr>
-          <w:rFonts w:ascii="Times New Roman" w:eastAsia="宋体" w:hAnsi="Times New Roman" w:cs="Times New Roman"/>
-          <w:sz w:val="24"/>
-        </w:rPr>
-      </w:pPr>
-    </w:p>
-    <w:p>
-      <w:pPr>
-        <w:spacing w:line="360" w:lineRule="auto"/>
-        <w:rPr>
-          <w:rFonts w:ascii="Times New Roman" w:eastAsia="宋体" w:hAnsi="Times New Roman" w:cs="Times New Roman"/>
-          <w:b/>
-          <w:sz w:val="24"/>
-        </w:rPr>
-      </w:pPr>
-      <w:r>
-        <w:rPr>
-          <w:rFonts w:ascii="Times New Roman" w:eastAsia="宋体" w:hAnsi="Times New Roman" w:cs="Times New Roman" w:hint="eastAsia"/>
+          <w:rFonts w:ascii="Times New Roman" w:eastAsia="SimSun" w:hAnsi="Times New Roman" w:cs="Times New Roman"/>
+          <w:sz w:val="24"/>
+        </w:rPr>
+      </w:pPr>
+    </w:p>
+    <w:p>
+      <w:pPr>
+        <w:spacing w:line="360" w:lineRule="auto"/>
+        <w:rPr>
+          <w:rFonts w:ascii="Times New Roman" w:eastAsia="SimSun" w:hAnsi="Times New Roman" w:cs="Times New Roman"/>
+          <w:b/>
+          <w:sz w:val="24"/>
+        </w:rPr>
+      </w:pPr>
+      <w:r>
+        <w:rPr>
+          <w:rFonts w:ascii="Times New Roman" w:eastAsia="SimSun" w:hAnsi="Times New Roman" w:cs="Times New Roman" w:hint="eastAsia"/>
           <w:b/>
           <w:sz w:val="28"/>
         </w:rPr>
@@ -2137,7 +2125,7 @@
       </w:r>
       <w:r>
         <w:rPr>
-          <w:rFonts w:ascii="Times New Roman" w:eastAsia="宋体" w:hAnsi="Times New Roman" w:cs="Times New Roman" w:hint="eastAsia"/>
+          <w:rFonts w:ascii="Times New Roman" w:eastAsia="SimSun" w:hAnsi="Times New Roman" w:cs="Times New Roman" w:hint="eastAsia"/>
           <w:b/>
           <w:sz w:val="28"/>
         </w:rPr>
@@ -2145,7 +2133,7 @@
       </w:r>
       <w:r>
         <w:rPr>
-          <w:rFonts w:ascii="Times New Roman" w:eastAsia="宋体" w:hAnsi="Times New Roman" w:cs="Times New Roman" w:hint="eastAsia"/>
+          <w:rFonts w:ascii="Times New Roman" w:eastAsia="SimSun" w:hAnsi="Times New Roman" w:cs="Times New Roman" w:hint="eastAsia"/>
           <w:b/>
           <w:sz w:val="28"/>
         </w:rPr>
@@ -2153,7 +2141,7 @@
       </w:r>
       <w:r>
         <w:rPr>
-          <w:rFonts w:ascii="Times New Roman" w:eastAsia="宋体" w:hAnsi="Times New Roman" w:cs="Times New Roman" w:hint="eastAsia"/>
+          <w:rFonts w:ascii="Times New Roman" w:eastAsia="SimSun" w:hAnsi="Times New Roman" w:cs="Times New Roman" w:hint="eastAsia"/>
           <w:b/>
           <w:sz w:val="28"/>
         </w:rPr>
@@ -2161,7 +2149,7 @@
       </w:r>
       <w:r>
         <w:rPr>
-          <w:rFonts w:ascii="Times New Roman" w:eastAsia="宋体" w:hAnsi="Times New Roman" w:cs="Times New Roman"/>
+          <w:rFonts w:ascii="Times New Roman" w:eastAsia="SimSun" w:hAnsi="Times New Roman" w:cs="Times New Roman"/>
           <w:b/>
           <w:sz w:val="28"/>
         </w:rPr>
@@ -2169,7 +2157,7 @@
       </w:r>
       <w:r>
         <w:rPr>
-          <w:rFonts w:ascii="Times New Roman" w:eastAsia="宋体" w:hAnsi="Times New Roman" w:cs="Times New Roman" w:hint="eastAsia"/>
+          <w:rFonts w:ascii="Times New Roman" w:eastAsia="SimSun" w:hAnsi="Times New Roman" w:cs="Times New Roman" w:hint="eastAsia"/>
           <w:b/>
           <w:sz w:val="24"/>
         </w:rPr>
@@ -2180,46 +2168,42 @@
       <w:pPr>
         <w:spacing w:line="360" w:lineRule="auto"/>
         <w:rPr>
-          <w:rFonts w:ascii="Times New Roman" w:eastAsia="宋体" w:hAnsi="Times New Roman" w:cs="Times New Roman"/>
-          <w:sz w:val="24"/>
-        </w:rPr>
-      </w:pPr>
-      <w:r>
-        <w:rPr>
-          <w:rFonts w:ascii="Times New Roman" w:eastAsia="宋体" w:hAnsi="Times New Roman" w:cs="Times New Roman" w:hint="eastAsia"/>
+          <w:rFonts w:ascii="Times New Roman" w:eastAsia="SimSun" w:hAnsi="Times New Roman" w:cs="Times New Roman"/>
+          <w:sz w:val="24"/>
+        </w:rPr>
+      </w:pPr>
+      <w:r>
+        <w:rPr>
+          <w:rFonts w:ascii="Times New Roman" w:eastAsia="SimSun" w:hAnsi="Times New Roman" w:cs="Times New Roman" w:hint="eastAsia"/>
           <w:sz w:val="24"/>
         </w:rPr>
         <w:t>按照标准格式，限</w:t>
       </w:r>
       <w:r>
         <w:rPr>
-          <w:rFonts w:ascii="Times New Roman" w:eastAsia="宋体" w:hAnsi="Times New Roman" w:cs="Times New Roman" w:hint="eastAsia"/>
+          <w:rFonts w:ascii="Times New Roman" w:eastAsia="SimSun" w:hAnsi="Times New Roman" w:cs="Times New Roman" w:hint="eastAsia"/>
           <w:sz w:val="24"/>
         </w:rPr>
         <w:t>20</w:t>
       </w:r>
       <w:r>
         <w:rPr>
-          <w:rFonts w:ascii="Times New Roman" w:eastAsia="宋体" w:hAnsi="Times New Roman" w:cs="Times New Roman" w:hint="eastAsia"/>
+          <w:rFonts w:ascii="Times New Roman" w:eastAsia="SimSun" w:hAnsi="Times New Roman" w:cs="Times New Roman" w:hint="eastAsia"/>
           <w:sz w:val="24"/>
         </w:rPr>
         <w:t>篇以内</w:t>
       </w:r>
       <w:r>
         <w:rPr>
-          <w:rFonts w:ascii="Times New Roman" w:eastAsia="宋体" w:hAnsi="Times New Roman" w:cs="Times New Roman" w:hint="eastAsia"/>
+          <w:rFonts w:ascii="Times New Roman" w:eastAsia="SimSun" w:hAnsi="Times New Roman" w:cs="Times New Roman" w:hint="eastAsia"/>
           <w:sz w:val="24"/>
         </w:rPr>
         <w:t>。</w:t>
       </w:r>
     </w:p>
     <w:sectPr>
-      <w:headerReference w:type="even" r:id="rId7"/>
-      <w:headerReference w:type="default" r:id="rId8"/>
-      <w:footerReference w:type="even" r:id="rId9"/>
-      <w:footerReference w:type="default" r:id="rId10"/>
-      <w:headerReference w:type="first" r:id="rId11"/>
-      <w:footerReference w:type="first" r:id="rId12"/>
+      <w:headerReference w:type="default" r:id="rId7"/>
+      <w:footerReference w:type="default" r:id="rId8"/>
       <w:pgSz w:w="11906" w:h="16838"/>
       <w:pgMar w:top="1440" w:right="1800" w:bottom="1440" w:left="1800" w:header="851" w:footer="992" w:gutter="0"/>
       <w:cols w:space="425"/>
@@ -2233,11 +2217,6 @@
 <w:endnotes xmlns:wpc="http://schemas.microsoft.com/office/word/2010/wordprocessingCanvas" xmlns:cx="http://schemas.microsoft.com/office/drawing/2014/chartex" xmlns:cx1="http://schemas.microsoft.com/office/drawing/2015/9/8/chartex" xmlns:cx2="http://schemas.microsoft.com/office/drawing/2015/10/21/chartex" xmlns:cx3="http://schemas.microsoft.com/office/drawing/2016/5/9/chartex" xmlns:cx4="http://schemas.microsoft.com/office/drawing/2016/5/10/chartex" xmlns:cx5="http://schemas.microsoft.com/office/drawing/2016/5/11/chartex" xmlns:cx6="http://schemas.microsoft.com/office/drawing/2016/5/12/chartex" xmlns:cx7="http://schemas.microsoft.com/office/drawing/2016/5/13/chartex" xmlns:cx8="http://schemas.microsoft.com/office/drawing/2016/5/14/chartex" xmlns:mc="http://schemas.openxmlformats.org/markup-compatibility/2006" xmlns:aink="http://schemas.microsoft.com/office/drawing/2016/ink" xmlns:am3d="http://schemas.microsoft.com/office/drawing/2017/model3d" xmlns:o="urn:schemas-microsoft-com:office:office" xmlns:oel="http://schemas.microsoft.com/office/2019/extlst" xmlns:r="http://schemas.openxmlformats.org/officeDocument/2006/relationships" xmlns:m="http://schemas.openxmlformats.org/officeDocument/2006/math" xmlns:v="urn:schemas-microsoft-com:vml" xmlns:wp14="http://schemas.microsoft.com/office/word/2010/wordprocessingDrawing" xmlns:wp="http://schemas.openxmlformats.org/drawingml/2006/wordprocessingDrawing" xmlns:w10="urn:schemas-microsoft-com:office:word" xmlns:w="http://schemas.openxmlformats.org/wordprocessingml/2006/main" xmlns:w14="http://schemas.microsoft.com/office/word/2010/wordml" xmlns:w15="http://schemas.microsoft.com/office/word/2012/wordml" xmlns:w16cex="http://schemas.microsoft.com/office/word/2018/wordml/cex" xmlns:w16cid="http://schemas.microsoft.com/office/word/2016/wordml/cid" xmlns:w16="http://schemas.microsoft.com/office/word/2018/wordml" xmlns:w16du="http://schemas.microsoft.com/office/word/2023/wordml/word16du" xmlns:w16sdtdh="http://schemas.microsoft.com/office/word/2020/wordml/sdtdatahash" xmlns:w16sdtfl="http://schemas.microsoft.com/office/word/2024/wordml/sdtformatlock" xmlns:w16se="http://schemas.microsoft.com/office/word/2015/wordml/symex" xmlns:wpg="http://schemas.microsoft.com/office/word/2010/wordprocessingGroup" xmlns:wpi="http://schemas.microsoft.com/office/word/2010/wordprocessingInk" xmlns:wne="http://schemas.microsoft.com/office/word/2006/wordml" xmlns:wps="http://schemas.microsoft.com/office/word/2010/wordprocessingShape" mc:Ignorable="w14 w15 w16se w16cid w16 w16cex w16sdtdh w16sdtfl w16du wp14">
   <w:endnote w:type="separator" w:id="-1">
     <w:p>
-      <w:pPr>
-        <w:rPr>
-          <w:rFonts w:hint="eastAsia"/>
-        </w:rPr>
-      </w:pPr>
       <w:r>
         <w:separator/>
       </w:r>
@@ -2245,11 +2224,6 @@
   </w:endnote>
   <w:endnote w:type="continuationSeparator" w:id="0">
     <w:p>
-      <w:pPr>
-        <w:rPr>
-          <w:rFonts w:hint="eastAsia"/>
-        </w:rPr>
-      </w:pPr>
       <w:r>
         <w:continuationSeparator/>
       </w:r>
@@ -2259,19 +2233,6 @@
 </file>
 
 <file path=word/footer1.xml><?xml version="1.0" encoding="utf-8"?>
-<w:ftr xmlns:wpc="http://schemas.microsoft.com/office/word/2010/wordprocessingCanvas" xmlns:cx="http://schemas.microsoft.com/office/drawing/2014/chartex" xmlns:cx1="http://schemas.microsoft.com/office/drawing/2015/9/8/chartex" xmlns:cx2="http://schemas.microsoft.com/office/drawing/2015/10/21/chartex" xmlns:cx3="http://schemas.microsoft.com/office/drawing/2016/5/9/chartex" xmlns:cx4="http://schemas.microsoft.com/office/drawing/2016/5/10/chartex" xmlns:cx5="http://schemas.microsoft.com/office/drawing/2016/5/11/chartex" xmlns:cx6="http://schemas.microsoft.com/office/drawing/2016/5/12/chartex" xmlns:cx7="http://schemas.microsoft.com/office/drawing/2016/5/13/chartex" xmlns:cx8="http://schemas.microsoft.com/office/drawing/2016/5/14/chartex" xmlns:mc="http://schemas.openxmlformats.org/markup-compatibility/2006" xmlns:aink="http://schemas.microsoft.com/office/drawing/2016/ink" xmlns:am3d="http://schemas.microsoft.com/office/drawing/2017/model3d" xmlns:o="urn:schemas-microsoft-com:office:office" xmlns:oel="http://schemas.microsoft.com/office/2019/extlst" xmlns:r="http://schemas.openxmlformats.org/officeDocument/2006/relationships" xmlns:m="http://schemas.openxmlformats.org/officeDocument/2006/math" xmlns:v="urn:schemas-microsoft-com:vml" xmlns:wp14="http://schemas.microsoft.com/office/word/2010/wordprocessingDrawing" xmlns:wp="http://schemas.openxmlformats.org/drawingml/2006/wordprocessingDrawing" xmlns:w10="urn:schemas-microsoft-com:office:word" xmlns:w="http://schemas.openxmlformats.org/wordprocessingml/2006/main" xmlns:w14="http://schemas.microsoft.com/office/word/2010/wordml" xmlns:w15="http://schemas.microsoft.com/office/word/2012/wordml" xmlns:w16cex="http://schemas.microsoft.com/office/word/2018/wordml/cex" xmlns:w16cid="http://schemas.microsoft.com/office/word/2016/wordml/cid" xmlns:w16="http://schemas.microsoft.com/office/word/2018/wordml" xmlns:w16du="http://schemas.microsoft.com/office/word/2023/wordml/word16du" xmlns:w16sdtdh="http://schemas.microsoft.com/office/word/2020/wordml/sdtdatahash" xmlns:w16sdtfl="http://schemas.microsoft.com/office/word/2024/wordml/sdtformatlock" xmlns:w16se="http://schemas.microsoft.com/office/word/2015/wordml/symex" xmlns:wpg="http://schemas.microsoft.com/office/word/2010/wordprocessingGroup" xmlns:wpi="http://schemas.microsoft.com/office/word/2010/wordprocessingInk" xmlns:wne="http://schemas.microsoft.com/office/word/2006/wordml" xmlns:wps="http://schemas.microsoft.com/office/word/2010/wordprocessingShape" mc:Ignorable="w14 w15 w16se w16cid w16 w16cex w16sdtdh w16sdtfl w16du wp14">
-  <w:p>
-    <w:pPr>
-      <w:pStyle w:val="a6"/>
-      <w:rPr>
-        <w:rFonts w:hint="eastAsia"/>
-      </w:rPr>
-    </w:pPr>
-  </w:p>
-</w:ftr>
-</file>
-
-<file path=word/footer2.xml><?xml version="1.0" encoding="utf-8"?>
 <w:ftr xmlns:wpc="http://schemas.microsoft.com/office/word/2010/wordprocessingCanvas" xmlns:cx="http://schemas.microsoft.com/office/drawing/2014/chartex" xmlns:cx1="http://schemas.microsoft.com/office/drawing/2015/9/8/chartex" xmlns:cx2="http://schemas.microsoft.com/office/drawing/2015/10/21/chartex" xmlns:cx3="http://schemas.microsoft.com/office/drawing/2016/5/9/chartex" xmlns:cx4="http://schemas.microsoft.com/office/drawing/2016/5/10/chartex" xmlns:cx5="http://schemas.microsoft.com/office/drawing/2016/5/11/chartex" xmlns:cx6="http://schemas.microsoft.com/office/drawing/2016/5/12/chartex" xmlns:cx7="http://schemas.microsoft.com/office/drawing/2016/5/13/chartex" xmlns:cx8="http://schemas.microsoft.com/office/drawing/2016/5/14/chartex" xmlns:mc="http://schemas.openxmlformats.org/markup-compatibility/2006" xmlns:aink="http://schemas.microsoft.com/office/drawing/2016/ink" xmlns:am3d="http://schemas.microsoft.com/office/drawing/2017/model3d" xmlns:o="urn:schemas-microsoft-com:office:office" xmlns:oel="http://schemas.microsoft.com/office/2019/extlst" xmlns:r="http://schemas.openxmlformats.org/officeDocument/2006/relationships" xmlns:m="http://schemas.openxmlformats.org/officeDocument/2006/math" xmlns:v="urn:schemas-microsoft-com:vml" xmlns:wp14="http://schemas.microsoft.com/office/word/2010/wordprocessingDrawing" xmlns:wp="http://schemas.openxmlformats.org/drawingml/2006/wordprocessingDrawing" xmlns:w10="urn:schemas-microsoft-com:office:word" xmlns:w="http://schemas.openxmlformats.org/wordprocessingml/2006/main" xmlns:w14="http://schemas.microsoft.com/office/word/2010/wordml" xmlns:w15="http://schemas.microsoft.com/office/word/2012/wordml" xmlns:w16cex="http://schemas.microsoft.com/office/word/2018/wordml/cex" xmlns:w16cid="http://schemas.microsoft.com/office/word/2016/wordml/cid" xmlns:w16="http://schemas.microsoft.com/office/word/2018/wordml" xmlns:w16du="http://schemas.microsoft.com/office/word/2023/wordml/word16du" xmlns:w16sdtdh="http://schemas.microsoft.com/office/word/2020/wordml/sdtdatahash" xmlns:w16sdtfl="http://schemas.microsoft.com/office/word/2024/wordml/sdtformatlock" xmlns:w16se="http://schemas.microsoft.com/office/word/2015/wordml/symex" xmlns:wpg="http://schemas.microsoft.com/office/word/2010/wordprocessingGroup" xmlns:wpi="http://schemas.microsoft.com/office/word/2010/wordprocessingInk" xmlns:wne="http://schemas.microsoft.com/office/word/2006/wordml" xmlns:wps="http://schemas.microsoft.com/office/word/2010/wordprocessingShape" mc:Ignorable="w14 w15 w16se w16cid w16 w16cex w16sdtdh w16sdtfl w16du wp14">
   <w:sdt>
     <w:sdtPr>
@@ -2292,9 +2253,6 @@
         <w:pPr>
           <w:pStyle w:val="a6"/>
           <w:jc w:val="center"/>
-          <w:rPr>
-            <w:rFonts w:hint="eastAsia"/>
-          </w:rPr>
         </w:pPr>
         <w:r>
           <w:fldChar w:fldCharType="begin"/>
@@ -2325,22 +2283,6 @@
   <w:p>
     <w:pPr>
       <w:pStyle w:val="a6"/>
-      <w:rPr>
-        <w:rFonts w:hint="eastAsia"/>
-      </w:rPr>
-    </w:pPr>
-  </w:p>
-</w:ftr>
-</file>
-
-<file path=word/footer3.xml><?xml version="1.0" encoding="utf-8"?>
-<w:ftr xmlns:wpc="http://schemas.microsoft.com/office/word/2010/wordprocessingCanvas" xmlns:cx="http://schemas.microsoft.com/office/drawing/2014/chartex" xmlns:cx1="http://schemas.microsoft.com/office/drawing/2015/9/8/chartex" xmlns:cx2="http://schemas.microsoft.com/office/drawing/2015/10/21/chartex" xmlns:cx3="http://schemas.microsoft.com/office/drawing/2016/5/9/chartex" xmlns:cx4="http://schemas.microsoft.com/office/drawing/2016/5/10/chartex" xmlns:cx5="http://schemas.microsoft.com/office/drawing/2016/5/11/chartex" xmlns:cx6="http://schemas.microsoft.com/office/drawing/2016/5/12/chartex" xmlns:cx7="http://schemas.microsoft.com/office/drawing/2016/5/13/chartex" xmlns:cx8="http://schemas.microsoft.com/office/drawing/2016/5/14/chartex" xmlns:mc="http://schemas.openxmlformats.org/markup-compatibility/2006" xmlns:aink="http://schemas.microsoft.com/office/drawing/2016/ink" xmlns:am3d="http://schemas.microsoft.com/office/drawing/2017/model3d" xmlns:o="urn:schemas-microsoft-com:office:office" xmlns:oel="http://schemas.microsoft.com/office/2019/extlst" xmlns:r="http://schemas.openxmlformats.org/officeDocument/2006/relationships" xmlns:m="http://schemas.openxmlformats.org/officeDocument/2006/math" xmlns:v="urn:schemas-microsoft-com:vml" xmlns:wp14="http://schemas.microsoft.com/office/word/2010/wordprocessingDrawing" xmlns:wp="http://schemas.openxmlformats.org/drawingml/2006/wordprocessingDrawing" xmlns:w10="urn:schemas-microsoft-com:office:word" xmlns:w="http://schemas.openxmlformats.org/wordprocessingml/2006/main" xmlns:w14="http://schemas.microsoft.com/office/word/2010/wordml" xmlns:w15="http://schemas.microsoft.com/office/word/2012/wordml" xmlns:w16cex="http://schemas.microsoft.com/office/word/2018/wordml/cex" xmlns:w16cid="http://schemas.microsoft.com/office/word/2016/wordml/cid" xmlns:w16="http://schemas.microsoft.com/office/word/2018/wordml" xmlns:w16du="http://schemas.microsoft.com/office/word/2023/wordml/word16du" xmlns:w16sdtdh="http://schemas.microsoft.com/office/word/2020/wordml/sdtdatahash" xmlns:w16sdtfl="http://schemas.microsoft.com/office/word/2024/wordml/sdtformatlock" xmlns:w16se="http://schemas.microsoft.com/office/word/2015/wordml/symex" xmlns:wpg="http://schemas.microsoft.com/office/word/2010/wordprocessingGroup" xmlns:wpi="http://schemas.microsoft.com/office/word/2010/wordprocessingInk" xmlns:wne="http://schemas.microsoft.com/office/word/2006/wordml" xmlns:wps="http://schemas.microsoft.com/office/word/2010/wordprocessingShape" mc:Ignorable="w14 w15 w16se w16cid w16 w16cex w16sdtdh w16sdtfl w16du wp14">
-  <w:p>
-    <w:pPr>
-      <w:pStyle w:val="a6"/>
-      <w:rPr>
-        <w:rFonts w:hint="eastAsia"/>
-      </w:rPr>
     </w:pPr>
   </w:p>
 </w:ftr>
@@ -2350,11 +2292,6 @@
 <w:footnotes xmlns:wpc="http://schemas.microsoft.com/office/word/2010/wordprocessingCanvas" xmlns:cx="http://schemas.microsoft.com/office/drawing/2014/chartex" xmlns:cx1="http://schemas.microsoft.com/office/drawing/2015/9/8/chartex" xmlns:cx2="http://schemas.microsoft.com/office/drawing/2015/10/21/chartex" xmlns:cx3="http://schemas.microsoft.com/office/drawing/2016/5/9/chartex" xmlns:cx4="http://schemas.microsoft.com/office/drawing/2016/5/10/chartex" xmlns:cx5="http://schemas.microsoft.com/office/drawing/2016/5/11/chartex" xmlns:cx6="http://schemas.microsoft.com/office/drawing/2016/5/12/chartex" xmlns:cx7="http://schemas.microsoft.com/office/drawing/2016/5/13/chartex" xmlns:cx8="http://schemas.microsoft.com/office/drawing/2016/5/14/chartex" xmlns:mc="http://schemas.openxmlformats.org/markup-compatibility/2006" xmlns:aink="http://schemas.microsoft.com/office/drawing/2016/ink" xmlns:am3d="http://schemas.microsoft.com/office/drawing/2017/model3d" xmlns:o="urn:schemas-microsoft-com:office:office" xmlns:oel="http://schemas.microsoft.com/office/2019/extlst" xmlns:r="http://schemas.openxmlformats.org/officeDocument/2006/relationships" xmlns:m="http://schemas.openxmlformats.org/officeDocument/2006/math" xmlns:v="urn:schemas-microsoft-com:vml" xmlns:wp14="http://schemas.microsoft.com/office/word/2010/wordprocessingDrawing" xmlns:wp="http://schemas.openxmlformats.org/drawingml/2006/wordprocessingDrawing" xmlns:w10="urn:schemas-microsoft-com:office:word" xmlns:w="http://schemas.openxmlformats.org/wordprocessingml/2006/main" xmlns:w14="http://schemas.microsoft.com/office/word/2010/wordml" xmlns:w15="http://schemas.microsoft.com/office/word/2012/wordml" xmlns:w16cex="http://schemas.microsoft.com/office/word/2018/wordml/cex" xmlns:w16cid="http://schemas.microsoft.com/office/word/2016/wordml/cid" xmlns:w16="http://schemas.microsoft.com/office/word/2018/wordml" xmlns:w16du="http://schemas.microsoft.com/office/word/2023/wordml/word16du" xmlns:w16sdtdh="http://schemas.microsoft.com/office/word/2020/wordml/sdtdatahash" xmlns:w16sdtfl="http://schemas.microsoft.com/office/word/2024/wordml/sdtformatlock" xmlns:w16se="http://schemas.microsoft.com/office/word/2015/wordml/symex" xmlns:wpg="http://schemas.microsoft.com/office/word/2010/wordprocessingGroup" xmlns:wpi="http://schemas.microsoft.com/office/word/2010/wordprocessingInk" xmlns:wne="http://schemas.microsoft.com/office/word/2006/wordml" xmlns:wps="http://schemas.microsoft.com/office/word/2010/wordprocessingShape" mc:Ignorable="w14 w15 w16se w16cid w16 w16cex w16sdtdh w16sdtfl w16du wp14">
   <w:footnote w:type="separator" w:id="-1">
     <w:p>
-      <w:pPr>
-        <w:rPr>
-          <w:rFonts w:hint="eastAsia"/>
-        </w:rPr>
-      </w:pPr>
       <w:r>
         <w:separator/>
       </w:r>
@@ -2362,11 +2299,6 @@
   </w:footnote>
   <w:footnote w:type="continuationSeparator" w:id="0">
     <w:p>
-      <w:pPr>
-        <w:rPr>
-          <w:rFonts w:hint="eastAsia"/>
-        </w:rPr>
-      </w:pPr>
       <w:r>
         <w:continuationSeparator/>
       </w:r>
@@ -2379,23 +2311,7 @@
 <w:hdr xmlns:wpc="http://schemas.microsoft.com/office/word/2010/wordprocessingCanvas" xmlns:cx="http://schemas.microsoft.com/office/drawing/2014/chartex" xmlns:cx1="http://schemas.microsoft.com/office/drawing/2015/9/8/chartex" xmlns:cx2="http://schemas.microsoft.com/office/drawing/2015/10/21/chartex" xmlns:cx3="http://schemas.microsoft.com/office/drawing/2016/5/9/chartex" xmlns:cx4="http://schemas.microsoft.com/office/drawing/2016/5/10/chartex" xmlns:cx5="http://schemas.microsoft.com/office/drawing/2016/5/11/chartex" xmlns:cx6="http://schemas.microsoft.com/office/drawing/2016/5/12/chartex" xmlns:cx7="http://schemas.microsoft.com/office/drawing/2016/5/13/chartex" xmlns:cx8="http://schemas.microsoft.com/office/drawing/2016/5/14/chartex" xmlns:mc="http://schemas.openxmlformats.org/markup-compatibility/2006" xmlns:aink="http://schemas.microsoft.com/office/drawing/2016/ink" xmlns:am3d="http://schemas.microsoft.com/office/drawing/2017/model3d" xmlns:o="urn:schemas-microsoft-com:office:office" xmlns:oel="http://schemas.microsoft.com/office/2019/extlst" xmlns:r="http://schemas.openxmlformats.org/officeDocument/2006/relationships" xmlns:m="http://schemas.openxmlformats.org/officeDocument/2006/math" xmlns:v="urn:schemas-microsoft-com:vml" xmlns:wp14="http://schemas.microsoft.com/office/word/2010/wordprocessingDrawing" xmlns:wp="http://schemas.openxmlformats.org/drawingml/2006/wordprocessingDrawing" xmlns:w10="urn:schemas-microsoft-com:office:word" xmlns:w="http://schemas.openxmlformats.org/wordprocessingml/2006/main" xmlns:w14="http://schemas.microsoft.com/office/word/2010/wordml" xmlns:w15="http://schemas.microsoft.com/office/word/2012/wordml" xmlns:w16cex="http://schemas.microsoft.com/office/word/2018/wordml/cex" xmlns:w16cid="http://schemas.microsoft.com/office/word/2016/wordml/cid" xmlns:w16="http://schemas.microsoft.com/office/word/2018/wordml" xmlns:w16du="http://schemas.microsoft.com/office/word/2023/wordml/word16du" xmlns:w16sdtdh="http://schemas.microsoft.com/office/word/2020/wordml/sdtdatahash" xmlns:w16sdtfl="http://schemas.microsoft.com/office/word/2024/wordml/sdtformatlock" xmlns:w16se="http://schemas.microsoft.com/office/word/2015/wordml/symex" xmlns:wpg="http://schemas.microsoft.com/office/word/2010/wordprocessingGroup" xmlns:wpi="http://schemas.microsoft.com/office/word/2010/wordprocessingInk" xmlns:wne="http://schemas.microsoft.com/office/word/2006/wordml" xmlns:wps="http://schemas.microsoft.com/office/word/2010/wordprocessingShape" mc:Ignorable="w14 w15 w16se w16cid w16 w16cex w16sdtdh w16sdtfl w16du wp14">
   <w:p>
     <w:pPr>
-      <w:pStyle w:val="a4"/>
-      <w:rPr>
-        <w:rFonts w:hint="eastAsia"/>
-      </w:rPr>
-    </w:pPr>
-  </w:p>
-</w:hdr>
-</file>
-
-<file path=word/header2.xml><?xml version="1.0" encoding="utf-8"?>
-<w:hdr xmlns:wpc="http://schemas.microsoft.com/office/word/2010/wordprocessingCanvas" xmlns:cx="http://schemas.microsoft.com/office/drawing/2014/chartex" xmlns:cx1="http://schemas.microsoft.com/office/drawing/2015/9/8/chartex" xmlns:cx2="http://schemas.microsoft.com/office/drawing/2015/10/21/chartex" xmlns:cx3="http://schemas.microsoft.com/office/drawing/2016/5/9/chartex" xmlns:cx4="http://schemas.microsoft.com/office/drawing/2016/5/10/chartex" xmlns:cx5="http://schemas.microsoft.com/office/drawing/2016/5/11/chartex" xmlns:cx6="http://schemas.microsoft.com/office/drawing/2016/5/12/chartex" xmlns:cx7="http://schemas.microsoft.com/office/drawing/2016/5/13/chartex" xmlns:cx8="http://schemas.microsoft.com/office/drawing/2016/5/14/chartex" xmlns:mc="http://schemas.openxmlformats.org/markup-compatibility/2006" xmlns:aink="http://schemas.microsoft.com/office/drawing/2016/ink" xmlns:am3d="http://schemas.microsoft.com/office/drawing/2017/model3d" xmlns:o="urn:schemas-microsoft-com:office:office" xmlns:oel="http://schemas.microsoft.com/office/2019/extlst" xmlns:r="http://schemas.openxmlformats.org/officeDocument/2006/relationships" xmlns:m="http://schemas.openxmlformats.org/officeDocument/2006/math" xmlns:v="urn:schemas-microsoft-com:vml" xmlns:wp14="http://schemas.microsoft.com/office/word/2010/wordprocessingDrawing" xmlns:wp="http://schemas.openxmlformats.org/drawingml/2006/wordprocessingDrawing" xmlns:w10="urn:schemas-microsoft-com:office:word" xmlns:w="http://schemas.openxmlformats.org/wordprocessingml/2006/main" xmlns:w14="http://schemas.microsoft.com/office/word/2010/wordml" xmlns:w15="http://schemas.microsoft.com/office/word/2012/wordml" xmlns:w16cex="http://schemas.microsoft.com/office/word/2018/wordml/cex" xmlns:w16cid="http://schemas.microsoft.com/office/word/2016/wordml/cid" xmlns:w16="http://schemas.microsoft.com/office/word/2018/wordml" xmlns:w16du="http://schemas.microsoft.com/office/word/2023/wordml/word16du" xmlns:w16sdtdh="http://schemas.microsoft.com/office/word/2020/wordml/sdtdatahash" xmlns:w16sdtfl="http://schemas.microsoft.com/office/word/2024/wordml/sdtformatlock" xmlns:w16se="http://schemas.microsoft.com/office/word/2015/wordml/symex" xmlns:wpg="http://schemas.microsoft.com/office/word/2010/wordprocessingGroup" xmlns:wpi="http://schemas.microsoft.com/office/word/2010/wordprocessingInk" xmlns:wne="http://schemas.microsoft.com/office/word/2006/wordml" xmlns:wps="http://schemas.microsoft.com/office/word/2010/wordprocessingShape" mc:Ignorable="w14 w15 w16se w16cid w16 w16cex w16sdtdh w16sdtfl w16du wp14">
-  <w:p>
-    <w:pPr>
       <w:jc w:val="center"/>
-      <w:rPr>
-        <w:rFonts w:hint="eastAsia"/>
-      </w:rPr>
     </w:pPr>
     <w:r>
       <w:rPr>
@@ -2444,19 +2360,6 @@
         </wp:inline>
       </w:drawing>
     </w:r>
-  </w:p>
-</w:hdr>
-</file>
-
-<file path=word/header3.xml><?xml version="1.0" encoding="utf-8"?>
-<w:hdr xmlns:wpc="http://schemas.microsoft.com/office/word/2010/wordprocessingCanvas" xmlns:cx="http://schemas.microsoft.com/office/drawing/2014/chartex" xmlns:cx1="http://schemas.microsoft.com/office/drawing/2015/9/8/chartex" xmlns:cx2="http://schemas.microsoft.com/office/drawing/2015/10/21/chartex" xmlns:cx3="http://schemas.microsoft.com/office/drawing/2016/5/9/chartex" xmlns:cx4="http://schemas.microsoft.com/office/drawing/2016/5/10/chartex" xmlns:cx5="http://schemas.microsoft.com/office/drawing/2016/5/11/chartex" xmlns:cx6="http://schemas.microsoft.com/office/drawing/2016/5/12/chartex" xmlns:cx7="http://schemas.microsoft.com/office/drawing/2016/5/13/chartex" xmlns:cx8="http://schemas.microsoft.com/office/drawing/2016/5/14/chartex" xmlns:mc="http://schemas.openxmlformats.org/markup-compatibility/2006" xmlns:aink="http://schemas.microsoft.com/office/drawing/2016/ink" xmlns:am3d="http://schemas.microsoft.com/office/drawing/2017/model3d" xmlns:o="urn:schemas-microsoft-com:office:office" xmlns:oel="http://schemas.microsoft.com/office/2019/extlst" xmlns:r="http://schemas.openxmlformats.org/officeDocument/2006/relationships" xmlns:m="http://schemas.openxmlformats.org/officeDocument/2006/math" xmlns:v="urn:schemas-microsoft-com:vml" xmlns:wp14="http://schemas.microsoft.com/office/word/2010/wordprocessingDrawing" xmlns:wp="http://schemas.openxmlformats.org/drawingml/2006/wordprocessingDrawing" xmlns:w10="urn:schemas-microsoft-com:office:word" xmlns:w="http://schemas.openxmlformats.org/wordprocessingml/2006/main" xmlns:w14="http://schemas.microsoft.com/office/word/2010/wordml" xmlns:w15="http://schemas.microsoft.com/office/word/2012/wordml" xmlns:w16cex="http://schemas.microsoft.com/office/word/2018/wordml/cex" xmlns:w16cid="http://schemas.microsoft.com/office/word/2016/wordml/cid" xmlns:w16="http://schemas.microsoft.com/office/word/2018/wordml" xmlns:w16du="http://schemas.microsoft.com/office/word/2023/wordml/word16du" xmlns:w16sdtdh="http://schemas.microsoft.com/office/word/2020/wordml/sdtdatahash" xmlns:w16sdtfl="http://schemas.microsoft.com/office/word/2024/wordml/sdtformatlock" xmlns:w16se="http://schemas.microsoft.com/office/word/2015/wordml/symex" xmlns:wpg="http://schemas.microsoft.com/office/word/2010/wordprocessingGroup" xmlns:wpi="http://schemas.microsoft.com/office/word/2010/wordprocessingInk" xmlns:wne="http://schemas.microsoft.com/office/word/2006/wordml" xmlns:wps="http://schemas.microsoft.com/office/word/2010/wordprocessingShape" mc:Ignorable="w14 w15 w16se w16cid w16 w16cex w16sdtdh w16sdtfl w16du wp14">
-  <w:p>
-    <w:pPr>
-      <w:pStyle w:val="a4"/>
-      <w:rPr>
-        <w:rFonts w:hint="eastAsia"/>
-      </w:rPr>
-    </w:pPr>
   </w:p>
 </w:hdr>
 </file>
@@ -3378,7 +3281,6 @@
   <w:style w:type="character" w:default="1" w:styleId="a0">
     <w:name w:val="Default Paragraph Font"/>
     <w:uiPriority w:val="1"/>
-    <w:semiHidden/>
     <w:unhideWhenUsed/>
   </w:style>
   <w:style w:type="table" w:default="1" w:styleId="a1">

</xml_diff>